<commit_message>
docs(plano): detalha sprints do Marco M2 (MS3 - Atendimento Clinico, Exames, Vacinacao)
Adiciona Sprints 5-8 na secao 4, mirrando o formato das Sprints 1-4 do Marco M1.
Renumera as secoes 5-9 para 6-10. Baseado na ERS (RF-ATD, RF-EXM, RF-VAC) e no
ADR-001 (Clinical/MS3 como servico unico).
</commit_message>
<xml_diff>
--- a/Documentação/PlanoTrabalho_KA_Construcao_VetEquine.docx
+++ b/Documentação/PlanoTrabalho_KA_Construcao_VetEquine.docx
@@ -7094,7 +7094,2514 @@
           <w:sz w:val="30"/>
           <w:szCs w:val="30"/>
         </w:rPr>
-        <w:t xml:space="preserve">5. Fluxo de Orquestracao Semanal</w:t>
+        <w:t xml:space="preserve">5. Detalhamento dos Sprints -- Marco M2 (Setembro/2026)</w:t>
+      </w:r>
+    </w:p>
+    <w:p>
+      <w:pPr>
+        <w:spacing w:after="80" w:before="80" w:line="340"/>
+        <w:jc w:val="both"/>
+      </w:pPr>
+      <w:r>
+        <w:rPr>
+          <w:rFonts w:ascii="Arial" w:cs="Arial" w:eastAsia="Arial" w:hAnsi="Arial"/>
+          <w:sz w:val="22"/>
+          <w:szCs w:val="22"/>
+        </w:rPr>
+        <w:t xml:space="preserve">O Marco M2 e composto por 4 sprints de 2 semanas cada (8 semanas), cobrindo o microsservico Clinical (MS3): Atendimento Clinico / Ficha Clinica, Exames e Vacinacao (ADR-001, secao 3). Reaproveita a fundacao de RLS, broker/BullMQ e CI/CD estabelecida no Marco M1 -- o DeductionService de MS2 (Sprint 3) ja consome o evento de consumo de estoque que este marco passa a publicar (RN-003).</w:t>
+      </w:r>
+    </w:p>
+    <w:p>
+      <w:pPr>
+        <w:spacing w:after="0" w:before="80"/>
+      </w:pPr>
+    </w:p>
+    <w:p>
+      <w:pPr>
+        <w:pStyle w:val="Heading2"/>
+        <w:spacing w:after="100" w:before="260"/>
+      </w:pPr>
+      <w:r>
+        <w:rPr>
+          <w:rFonts w:ascii="Arial" w:cs="Arial" w:eastAsia="Arial" w:hAnsi="Arial"/>
+          <w:b/>
+          <w:bCs/>
+          <w:color w:val="1D9E75"/>
+          <w:sz w:val="26"/>
+          <w:szCs w:val="26"/>
+        </w:rPr>
+        <w:t xml:space="preserve">Sprint 5 -- Semanas 9 e 10: Atendimento Clinico / Ficha Clinica (MS3)</w:t>
+      </w:r>
+    </w:p>
+    <w:p>
+      <w:pPr>
+        <w:spacing w:after="80" w:before="80" w:line="340"/>
+        <w:jc w:val="both"/>
+      </w:pPr>
+      <w:r>
+        <w:rPr>
+          <w:rFonts w:ascii="Arial" w:cs="Arial" w:eastAsia="Arial" w:hAnsi="Arial"/>
+          <w:color w:val="666666"/>
+          <w:sz w:val="22"/>
+          <w:szCs w:val="22"/>
+        </w:rPr>
+        <w:t xml:space="preserve">Objetivo: ficha clinica digital completa, orcamento automatico e baixa de estoque via evento no broker (RN-003), consumido pelo DeductionService ja existente em MS2.</w:t>
+      </w:r>
+    </w:p>
+    <w:p>
+      <w:pPr>
+        <w:spacing w:after="0" w:before="80"/>
+      </w:pPr>
+    </w:p>
+    <w:tbl>
+      <w:tblPr>
+        <w:tblW w:type="dxa" w:w="9360"/>
+        <w:tblBorders>
+          <w:top w:val="single" w:color="auto" w:sz="4"/>
+          <w:left w:val="single" w:color="auto" w:sz="4"/>
+          <w:bottom w:val="single" w:color="auto" w:sz="4"/>
+          <w:right w:val="single" w:color="auto" w:sz="4"/>
+          <w:insideH w:val="single" w:color="auto" w:sz="4"/>
+          <w:insideV w:val="single" w:color="auto" w:sz="4"/>
+        </w:tblBorders>
+      </w:tblPr>
+      <w:tblGrid>
+        <w:gridCol w:w="4680"/>
+        <w:gridCol w:w="4680"/>
+      </w:tblGrid>
+      <w:tr>
+        <w:trPr>
+          <w:tblHeader/>
+        </w:trPr>
+        <w:tc>
+          <w:tcPr>
+            <w:tcW w:type="dxa" w:w="4680"/>
+            <w:tcBorders>
+              <w:top w:val="single" w:color="CCCCCC" w:sz="1"/>
+              <w:left w:val="single" w:color="CCCCCC" w:sz="1"/>
+              <w:bottom w:val="single" w:color="CCCCCC" w:sz="1"/>
+              <w:right w:val="single" w:color="CCCCCC" w:sz="1"/>
+            </w:tcBorders>
+            <w:shd w:fill="185FA5" w:val="clear"/>
+            <w:tcMar>
+              <w:top w:type="dxa" w:w="80"/>
+              <w:left w:type="dxa" w:w="120"/>
+              <w:bottom w:type="dxa" w:w="80"/>
+              <w:right w:type="dxa" w:w="120"/>
+            </w:tcMar>
+          </w:tcPr>
+          <w:p>
+            <w:pPr>
+              <w:jc w:val="center"/>
+            </w:pPr>
+            <w:r>
+              <w:rPr>
+                <w:rFonts w:ascii="Arial" w:cs="Arial" w:eastAsia="Arial" w:hAnsi="Arial"/>
+                <w:b/>
+                <w:bCs/>
+                <w:color w:val="FFFFFF"/>
+                <w:sz w:val="20"/>
+                <w:szCs w:val="20"/>
+              </w:rPr>
+              <w:t xml:space="preserve">Dev 1 - Marco Tulio  (Back / DB)</w:t>
+            </w:r>
+          </w:p>
+        </w:tc>
+        <w:tc>
+          <w:tcPr>
+            <w:tcW w:type="dxa" w:w="4680"/>
+            <w:tcBorders>
+              <w:top w:val="single" w:color="CCCCCC" w:sz="1"/>
+              <w:left w:val="single" w:color="CCCCCC" w:sz="1"/>
+              <w:bottom w:val="single" w:color="CCCCCC" w:sz="1"/>
+              <w:right w:val="single" w:color="CCCCCC" w:sz="1"/>
+            </w:tcBorders>
+            <w:shd w:fill="117A65" w:val="clear"/>
+            <w:tcMar>
+              <w:top w:type="dxa" w:w="80"/>
+              <w:left w:type="dxa" w:w="120"/>
+              <w:bottom w:type="dxa" w:w="80"/>
+              <w:right w:type="dxa" w:w="120"/>
+            </w:tcMar>
+          </w:tcPr>
+          <w:p>
+            <w:pPr>
+              <w:jc w:val="center"/>
+            </w:pPr>
+            <w:r>
+              <w:rPr>
+                <w:rFonts w:ascii="Arial" w:cs="Arial" w:eastAsia="Arial" w:hAnsi="Arial"/>
+                <w:b/>
+                <w:bCs/>
+                <w:color w:val="FFFFFF"/>
+                <w:sz w:val="20"/>
+                <w:szCs w:val="20"/>
+              </w:rPr>
+              <w:t xml:space="preserve">Dev 2 - Joao Paiva  (UI / Back)</w:t>
+            </w:r>
+          </w:p>
+        </w:tc>
+      </w:tr>
+      <w:tr>
+        <w:tc>
+          <w:tcPr>
+            <w:tcW w:type="dxa" w:w="4680"/>
+            <w:tcBorders>
+              <w:top w:val="single" w:color="CCCCCC" w:sz="1"/>
+              <w:left w:val="single" w:color="CCCCCC" w:sz="1"/>
+              <w:bottom w:val="single" w:color="CCCCCC" w:sz="1"/>
+              <w:right w:val="single" w:color="CCCCCC" w:sz="1"/>
+            </w:tcBorders>
+            <w:shd w:fill="EBF5FB" w:val="clear"/>
+            <w:tcMar>
+              <w:top w:type="dxa" w:w="80"/>
+              <w:left w:type="dxa" w:w="120"/>
+              <w:bottom w:type="dxa" w:w="80"/>
+              <w:right w:type="dxa" w:w="80"/>
+            </w:tcMar>
+          </w:tcPr>
+          <w:p>
+            <w:r>
+              <w:rPr>
+                <w:rFonts w:ascii="Arial" w:cs="Arial" w:eastAsia="Arial" w:hAnsi="Arial"/>
+                <w:sz w:val="20"/>
+                <w:szCs w:val="20"/>
+              </w:rPr>
+              <w:t xml:space="preserve">-&gt; Schema MS3: appointments, medical_records (ficha clinica em JSONB), prescriptions</w:t>
+            </w:r>
+          </w:p>
+        </w:tc>
+        <w:tc>
+          <w:tcPr>
+            <w:tcW w:type="dxa" w:w="4680"/>
+            <w:tcBorders>
+              <w:top w:val="single" w:color="CCCCCC" w:sz="1"/>
+              <w:left w:val="single" w:color="CCCCCC" w:sz="1"/>
+              <w:bottom w:val="single" w:color="CCCCCC" w:sz="1"/>
+              <w:right w:val="single" w:color="CCCCCC" w:sz="1"/>
+            </w:tcBorders>
+            <w:shd w:fill="EAFAF1" w:val="clear"/>
+            <w:tcMar>
+              <w:top w:type="dxa" w:w="80"/>
+              <w:left w:type="dxa" w:w="120"/>
+              <w:bottom w:type="dxa" w:w="80"/>
+              <w:right w:type="dxa" w:w="80"/>
+            </w:tcMar>
+          </w:tcPr>
+          <w:p>
+            <w:r>
+              <w:rPr>
+                <w:rFonts w:ascii="Arial" w:cs="Arial" w:eastAsia="Arial" w:hAnsi="Arial"/>
+                <w:sz w:val="20"/>
+                <w:szCs w:val="20"/>
+              </w:rPr>
+              <w:t xml:space="preserve">-&gt; Controllers MS3: Appointment, Prescription (Zod)</w:t>
+            </w:r>
+          </w:p>
+        </w:tc>
+      </w:tr>
+      <w:tr>
+        <w:tc>
+          <w:tcPr>
+            <w:tcW w:type="dxa" w:w="4680"/>
+            <w:tcBorders>
+              <w:top w:val="single" w:color="CCCCCC" w:sz="1"/>
+              <w:left w:val="single" w:color="CCCCCC" w:sz="1"/>
+              <w:bottom w:val="single" w:color="CCCCCC" w:sz="1"/>
+              <w:right w:val="single" w:color="CCCCCC" w:sz="1"/>
+            </w:tcBorders>
+            <w:shd w:fill="EBF5FB" w:val="clear"/>
+            <w:tcMar>
+              <w:top w:type="dxa" w:w="80"/>
+              <w:left w:type="dxa" w:w="120"/>
+              <w:bottom w:type="dxa" w:w="80"/>
+              <w:right w:type="dxa" w:w="80"/>
+            </w:tcMar>
+          </w:tcPr>
+          <w:p>
+            <w:r>
+              <w:rPr>
+                <w:rFonts w:ascii="Arial" w:cs="Arial" w:eastAsia="Arial" w:hAnsi="Arial"/>
+                <w:sz w:val="20"/>
+                <w:szCs w:val="20"/>
+              </w:rPr>
+              <w:t xml:space="preserve">-&gt; AppointmentService: calculo de orcamento -- itens de estoque, procedimentos, mao de obra, km rodado (RF-ATD-006/007)</w:t>
+            </w:r>
+          </w:p>
+        </w:tc>
+        <w:tc>
+          <w:tcPr>
+            <w:tcW w:type="dxa" w:w="4680"/>
+            <w:tcBorders>
+              <w:top w:val="single" w:color="CCCCCC" w:sz="1"/>
+              <w:left w:val="single" w:color="CCCCCC" w:sz="1"/>
+              <w:bottom w:val="single" w:color="CCCCCC" w:sz="1"/>
+              <w:right w:val="single" w:color="CCCCCC" w:sz="1"/>
+            </w:tcBorders>
+            <w:shd w:fill="EAFAF1" w:val="clear"/>
+            <w:tcMar>
+              <w:top w:type="dxa" w:w="80"/>
+              <w:left w:type="dxa" w:w="120"/>
+              <w:bottom w:type="dxa" w:w="80"/>
+              <w:right w:type="dxa" w:w="80"/>
+            </w:tcMar>
+          </w:tcPr>
+          <w:p>
+            <w:r>
+              <w:rPr>
+                <w:rFonts w:ascii="Arial" w:cs="Arial" w:eastAsia="Arial" w:hAnsi="Arial"/>
+                <w:sz w:val="20"/>
+                <w:szCs w:val="20"/>
+              </w:rPr>
+              <w:t xml:space="preserve">-&gt; Tela Nova Ficha Clinica: Proprietario -&gt; Propriedade -&gt; Animal (RF-ATD-003), historico/anamnese, exame fisico geral e especial, diagnostico/tratamento/prognostico</w:t>
+            </w:r>
+          </w:p>
+        </w:tc>
+      </w:tr>
+      <w:tr>
+        <w:tc>
+          <w:tcPr>
+            <w:tcW w:type="dxa" w:w="4680"/>
+            <w:tcBorders>
+              <w:top w:val="single" w:color="CCCCCC" w:sz="1"/>
+              <w:left w:val="single" w:color="CCCCCC" w:sz="1"/>
+              <w:bottom w:val="single" w:color="CCCCCC" w:sz="1"/>
+              <w:right w:val="single" w:color="CCCCCC" w:sz="1"/>
+            </w:tcBorders>
+            <w:shd w:fill="EBF5FB" w:val="clear"/>
+            <w:tcMar>
+              <w:top w:type="dxa" w:w="80"/>
+              <w:left w:type="dxa" w:w="120"/>
+              <w:bottom w:type="dxa" w:w="80"/>
+              <w:right w:type="dxa" w:w="80"/>
+            </w:tcMar>
+          </w:tcPr>
+          <w:p>
+            <w:r>
+              <w:rPr>
+                <w:rFonts w:ascii="Arial" w:cs="Arial" w:eastAsia="Arial" w:hAnsi="Arial"/>
+                <w:sz w:val="20"/>
+                <w:szCs w:val="20"/>
+              </w:rPr>
+              <w:t xml:space="preserve">-&gt; Publica evento de consumo de estoque no broker ao finalizar atendimento (RN-003, consumido pelo DeductionService de MS2)</w:t>
+            </w:r>
+          </w:p>
+        </w:tc>
+        <w:tc>
+          <w:tcPr>
+            <w:tcW w:type="dxa" w:w="4680"/>
+            <w:tcBorders>
+              <w:top w:val="single" w:color="CCCCCC" w:sz="1"/>
+              <w:left w:val="single" w:color="CCCCCC" w:sz="1"/>
+              <w:bottom w:val="single" w:color="CCCCCC" w:sz="1"/>
+              <w:right w:val="single" w:color="CCCCCC" w:sz="1"/>
+            </w:tcBorders>
+            <w:shd w:fill="EAFAF1" w:val="clear"/>
+            <w:tcMar>
+              <w:top w:type="dxa" w:w="80"/>
+              <w:left w:type="dxa" w:w="120"/>
+              <w:bottom w:type="dxa" w:w="80"/>
+              <w:right w:type="dxa" w:w="80"/>
+            </w:tcMar>
+          </w:tcPr>
+          <w:p>
+            <w:r>
+              <w:rPr>
+                <w:rFonts w:ascii="Arial" w:cs="Arial" w:eastAsia="Arial" w:hAnsi="Arial"/>
+                <w:sz w:val="20"/>
+                <w:szCs w:val="20"/>
+              </w:rPr>
+              <w:t xml:space="preserve">-&gt; Tela de orcamento: selecao de itens de estoque + procedimentos da tabela configurada (RF-ATD-006/007)</w:t>
+            </w:r>
+          </w:p>
+        </w:tc>
+      </w:tr>
+      <w:tr>
+        <w:tc>
+          <w:tcPr>
+            <w:tcW w:type="dxa" w:w="4680"/>
+            <w:tcBorders>
+              <w:top w:val="single" w:color="CCCCCC" w:sz="1"/>
+              <w:left w:val="single" w:color="CCCCCC" w:sz="1"/>
+              <w:bottom w:val="single" w:color="CCCCCC" w:sz="1"/>
+              <w:right w:val="single" w:color="CCCCCC" w:sz="1"/>
+            </w:tcBorders>
+            <w:shd w:fill="EBF5FB" w:val="clear"/>
+            <w:tcMar>
+              <w:top w:type="dxa" w:w="80"/>
+              <w:left w:type="dxa" w:w="120"/>
+              <w:bottom w:type="dxa" w:w="80"/>
+              <w:right w:type="dxa" w:w="80"/>
+            </w:tcMar>
+          </w:tcPr>
+          <w:p>
+            <w:r>
+              <w:rPr>
+                <w:rFonts w:ascii="Arial" w:cs="Arial" w:eastAsia="Arial" w:hAnsi="Arial"/>
+                <w:sz w:val="20"/>
+                <w:szCs w:val="20"/>
+              </w:rPr>
+              <w:t xml:space="preserve">-&gt; Pendencia financeira automatica ate registro de pagamento (RF-ATD-008)</w:t>
+            </w:r>
+          </w:p>
+        </w:tc>
+        <w:tc>
+          <w:tcPr>
+            <w:tcW w:type="dxa" w:w="4680"/>
+            <w:tcBorders>
+              <w:top w:val="single" w:color="CCCCCC" w:sz="1"/>
+              <w:left w:val="single" w:color="CCCCCC" w:sz="1"/>
+              <w:bottom w:val="single" w:color="CCCCCC" w:sz="1"/>
+              <w:right w:val="single" w:color="CCCCCC" w:sz="1"/>
+            </w:tcBorders>
+            <w:shd w:fill="EAFAF1" w:val="clear"/>
+            <w:tcMar>
+              <w:top w:type="dxa" w:w="80"/>
+              <w:left w:type="dxa" w:w="120"/>
+              <w:bottom w:type="dxa" w:w="80"/>
+              <w:right w:type="dxa" w:w="80"/>
+            </w:tcMar>
+          </w:tcPr>
+          <w:p>
+            <w:r>
+              <w:rPr>
+                <w:rFonts w:ascii="Arial" w:cs="Arial" w:eastAsia="Arial" w:hAnsi="Arial"/>
+                <w:sz w:val="20"/>
+                <w:szCs w:val="20"/>
+              </w:rPr>
+              <w:t xml:space="preserve">-&gt; Campo 'Local onde o animal esta', preenchimento livre (RF-ATD-004)</w:t>
+            </w:r>
+          </w:p>
+        </w:tc>
+      </w:tr>
+      <w:tr>
+        <w:tc>
+          <w:tcPr>
+            <w:tcW w:type="dxa" w:w="4680"/>
+            <w:tcBorders>
+              <w:top w:val="single" w:color="CCCCCC" w:sz="1"/>
+              <w:left w:val="single" w:color="CCCCCC" w:sz="1"/>
+              <w:bottom w:val="single" w:color="CCCCCC" w:sz="1"/>
+              <w:right w:val="single" w:color="CCCCCC" w:sz="1"/>
+            </w:tcBorders>
+            <w:shd w:fill="EBF5FB" w:val="clear"/>
+            <w:tcMar>
+              <w:top w:type="dxa" w:w="80"/>
+              <w:left w:type="dxa" w:w="120"/>
+              <w:bottom w:type="dxa" w:w="80"/>
+              <w:right w:type="dxa" w:w="80"/>
+            </w:tcMar>
+          </w:tcPr>
+          <w:p>
+            <w:r>
+              <w:rPr>
+                <w:rFonts w:ascii="Arial" w:cs="Arial" w:eastAsia="Arial" w:hAnsi="Arial"/>
+                <w:sz w:val="20"/>
+                <w:szCs w:val="20"/>
+              </w:rPr>
+              <w:t xml:space="preserve">-&gt; AppointmentRepository, PrescriptionRepository (RLS, soft delete)</w:t>
+            </w:r>
+          </w:p>
+        </w:tc>
+        <w:tc>
+          <w:tcPr>
+            <w:tcW w:type="dxa" w:w="4680"/>
+            <w:tcBorders>
+              <w:top w:val="single" w:color="CCCCCC" w:sz="1"/>
+              <w:left w:val="single" w:color="CCCCCC" w:sz="1"/>
+              <w:bottom w:val="single" w:color="CCCCCC" w:sz="1"/>
+              <w:right w:val="single" w:color="CCCCCC" w:sz="1"/>
+            </w:tcBorders>
+            <w:shd w:fill="EAFAF1" w:val="clear"/>
+            <w:tcMar>
+              <w:top w:type="dxa" w:w="80"/>
+              <w:left w:type="dxa" w:w="120"/>
+              <w:bottom w:type="dxa" w:w="80"/>
+              <w:right w:type="dxa" w:w="80"/>
+            </w:tcMar>
+          </w:tcPr>
+          <w:p>
+            <w:r>
+              <w:rPr>
+                <w:rFonts w:ascii="Arial" w:cs="Arial" w:eastAsia="Arial" w:hAnsi="Arial"/>
+                <w:sz w:val="20"/>
+                <w:szCs w:val="20"/>
+              </w:rPr>
+              <w:t xml:space="preserve">-&gt; Adapter de geracao de PDF da ficha clinica, com logomarca/CRMV/telefone/e-mail do veterinario (RF-ATD-009)</w:t>
+            </w:r>
+          </w:p>
+        </w:tc>
+      </w:tr>
+      <w:tr>
+        <w:tc>
+          <w:tcPr>
+            <w:tcW w:type="dxa" w:w="4680"/>
+            <w:tcBorders>
+              <w:top w:val="single" w:color="CCCCCC" w:sz="1"/>
+              <w:left w:val="single" w:color="CCCCCC" w:sz="1"/>
+              <w:bottom w:val="single" w:color="CCCCCC" w:sz="1"/>
+              <w:right w:val="single" w:color="CCCCCC" w:sz="1"/>
+            </w:tcBorders>
+            <w:shd w:fill="EBF5FB" w:val="clear"/>
+            <w:tcMar>
+              <w:top w:type="dxa" w:w="80"/>
+              <w:left w:type="dxa" w:w="120"/>
+              <w:bottom w:type="dxa" w:w="80"/>
+              <w:right w:type="dxa" w:w="80"/>
+            </w:tcMar>
+          </w:tcPr>
+          <w:p>
+            <w:r>
+              <w:rPr>
+                <w:rFonts w:ascii="Arial" w:cs="Arial" w:eastAsia="Arial" w:hAnsi="Arial"/>
+                <w:sz w:val="20"/>
+                <w:szCs w:val="20"/>
+              </w:rPr>
+              <w:t xml:space="preserve">-&gt; CI/CD: GitHub Actions para MS3 (lint-&gt;test-&gt;build-&gt;push)</w:t>
+            </w:r>
+          </w:p>
+        </w:tc>
+        <w:tc>
+          <w:tcPr>
+            <w:tcW w:type="dxa" w:w="4680"/>
+            <w:tcBorders>
+              <w:top w:val="single" w:color="CCCCCC" w:sz="1"/>
+              <w:left w:val="single" w:color="CCCCCC" w:sz="1"/>
+              <w:bottom w:val="single" w:color="CCCCCC" w:sz="1"/>
+              <w:right w:val="single" w:color="CCCCCC" w:sz="1"/>
+            </w:tcBorders>
+            <w:shd w:fill="EAFAF1" w:val="clear"/>
+            <w:tcMar>
+              <w:top w:type="dxa" w:w="80"/>
+              <w:left w:type="dxa" w:w="120"/>
+              <w:bottom w:type="dxa" w:w="80"/>
+              <w:right w:type="dxa" w:w="80"/>
+            </w:tcMar>
+          </w:tcPr>
+          <w:p>
+            <w:r>
+              <w:rPr>
+                <w:rFonts w:ascii="Arial" w:cs="Arial" w:eastAsia="Arial" w:hAnsi="Arial"/>
+                <w:sz w:val="20"/>
+                <w:szCs w:val="20"/>
+              </w:rPr>
+              <w:t xml:space="preserve">-&gt; Botao 'Agendar retorno' ao finalizar atendimento (placeholder ate o modulo de Agenda existir em M3) (RF-ATD-010)</w:t>
+            </w:r>
+          </w:p>
+        </w:tc>
+      </w:tr>
+      <w:tr>
+        <w:tc>
+          <w:tcPr>
+            <w:tcW w:type="dxa" w:w="4680"/>
+            <w:tcBorders>
+              <w:top w:val="single" w:color="CCCCCC" w:sz="1"/>
+              <w:left w:val="single" w:color="CCCCCC" w:sz="1"/>
+              <w:bottom w:val="single" w:color="CCCCCC" w:sz="1"/>
+              <w:right w:val="single" w:color="CCCCCC" w:sz="1"/>
+            </w:tcBorders>
+            <w:shd w:fill="EBF5FB" w:val="clear"/>
+            <w:tcMar>
+              <w:top w:type="dxa" w:w="80"/>
+              <w:left w:type="dxa" w:w="120"/>
+              <w:bottom w:type="dxa" w:w="80"/>
+              <w:right w:type="dxa" w:w="80"/>
+            </w:tcMar>
+          </w:tcPr>
+          <w:p>
+            <w:r>
+              <w:rPr>
+                <w:rFonts w:ascii="Arial" w:cs="Arial" w:eastAsia="Arial" w:hAnsi="Arial"/>
+                <w:sz w:val="20"/>
+                <w:szCs w:val="20"/>
+              </w:rPr>
+              <w:t xml:space="preserve">-&gt; Testes unitarios: AppointmentService (&gt;=70%). Publicar IAppointmentService em packages/shared-types</w:t>
+            </w:r>
+          </w:p>
+        </w:tc>
+        <w:tc>
+          <w:tcPr>
+            <w:tcW w:type="dxa" w:w="4680"/>
+            <w:tcBorders>
+              <w:top w:val="single" w:color="CCCCCC" w:sz="1"/>
+              <w:left w:val="single" w:color="CCCCCC" w:sz="1"/>
+              <w:bottom w:val="single" w:color="CCCCCC" w:sz="1"/>
+              <w:right w:val="single" w:color="CCCCCC" w:sz="1"/>
+            </w:tcBorders>
+            <w:shd w:fill="EAFAF1" w:val="clear"/>
+            <w:tcMar>
+              <w:top w:type="dxa" w:w="80"/>
+              <w:left w:type="dxa" w:w="120"/>
+              <w:bottom w:type="dxa" w:w="80"/>
+              <w:right w:type="dxa" w:w="80"/>
+            </w:tcMar>
+          </w:tcPr>
+          <w:p>
+            <w:r>
+              <w:rPr>
+                <w:rFonts w:ascii="Arial" w:cs="Arial" w:eastAsia="Arial" w:hAnsi="Arial"/>
+                <w:sz w:val="20"/>
+                <w:szCs w:val="20"/>
+              </w:rPr>
+              <w:t xml:space="preserve">-&gt; Testes E2E: fluxo completo de atendimento (novo -&gt; orcamento -&gt; finalizar -&gt; PDF)</w:t>
+            </w:r>
+          </w:p>
+        </w:tc>
+      </w:tr>
+    </w:tbl>
+    <w:p>
+      <w:pPr>
+        <w:spacing w:after="0" w:before="80"/>
+      </w:pPr>
+    </w:p>
+    <w:tbl>
+      <w:tblPr>
+        <w:tblW w:type="dxa" w:w="9360"/>
+        <w:tblBorders>
+          <w:top w:val="single" w:color="auto" w:sz="4"/>
+          <w:left w:val="single" w:color="auto" w:sz="4"/>
+          <w:bottom w:val="single" w:color="auto" w:sz="4"/>
+          <w:right w:val="single" w:color="auto" w:sz="4"/>
+          <w:insideH w:val="single" w:color="auto" w:sz="4"/>
+          <w:insideV w:val="single" w:color="auto" w:sz="4"/>
+        </w:tblBorders>
+      </w:tblPr>
+      <w:tblGrid>
+        <w:gridCol w:w="9360"/>
+      </w:tblGrid>
+      <w:tr>
+        <w:tc>
+          <w:tcPr>
+            <w:tcBorders>
+              <w:top w:val="single" w:color="117A65" w:sz="8"/>
+              <w:left w:val="single" w:color="117A65" w:sz="8"/>
+              <w:bottom w:val="single" w:color="CCCCCC" w:sz="1"/>
+              <w:right w:val="single" w:color="CCCCCC" w:sz="1"/>
+            </w:tcBorders>
+            <w:shd w:fill="EAFAF1" w:val="clear"/>
+            <w:tcMar>
+              <w:top w:type="dxa" w:w="120"/>
+              <w:left w:type="dxa" w:w="220"/>
+              <w:bottom w:type="dxa" w:w="120"/>
+              <w:right w:type="dxa" w:w="220"/>
+            </w:tcMar>
+          </w:tcPr>
+          <w:p>
+            <w:r>
+              <w:rPr>
+                <w:rFonts w:ascii="Arial" w:cs="Arial" w:eastAsia="Arial" w:hAnsi="Arial"/>
+                <w:b/>
+                <w:bCs/>
+                <w:color w:val="117A65"/>
+                <w:sz w:val="21"/>
+                <w:szCs w:val="21"/>
+              </w:rPr>
+              <w:t xml:space="preserve">Entregavel Sprint 5</w:t>
+            </w:r>
+          </w:p>
+          <w:p>
+            <w:pPr>
+              <w:spacing w:after="0" w:before="40"/>
+            </w:pPr>
+            <w:r>
+              <w:rPr>
+                <w:rFonts w:ascii="Arial" w:cs="Arial" w:eastAsia="Arial" w:hAnsi="Arial"/>
+                <w:sz w:val="20"/>
+                <w:szCs w:val="20"/>
+              </w:rPr>
+              <w:t xml:space="preserve">Ficha clinica digital completa, com orcamento automatico. Baixa de estoque via broker validada ponta a ponta com o DeductionService de MS2. PDF exportavel.</w:t>
+            </w:r>
+          </w:p>
+        </w:tc>
+      </w:tr>
+    </w:tbl>
+    <w:p>
+      <w:pPr>
+        <w:spacing w:after="0" w:before="80"/>
+      </w:pPr>
+    </w:p>
+    <w:p>
+      <w:pPr>
+        <w:pStyle w:val="Heading2"/>
+        <w:spacing w:after="100" w:before="260"/>
+      </w:pPr>
+      <w:r>
+        <w:rPr>
+          <w:rFonts w:ascii="Arial" w:cs="Arial" w:eastAsia="Arial" w:hAnsi="Arial"/>
+          <w:b/>
+          <w:bCs/>
+          <w:color w:val="1D9E75"/>
+          <w:sz w:val="26"/>
+          <w:szCs w:val="26"/>
+        </w:rPr>
+        <w:t xml:space="preserve">Sprint 6 -- Semanas 11 e 12: Exames (MS3)</w:t>
+      </w:r>
+    </w:p>
+    <w:p>
+      <w:pPr>
+        <w:spacing w:after="80" w:before="80" w:line="340"/>
+        <w:jc w:val="both"/>
+      </w:pPr>
+      <w:r>
+        <w:rPr>
+          <w:rFonts w:ascii="Arial" w:cs="Arial" w:eastAsia="Arial" w:hAnsi="Arial"/>
+          <w:color w:val="666666"/>
+          <w:sz w:val="22"/>
+          <w:szCs w:val="22"/>
+        </w:rPr>
+        <w:t xml:space="preserve">Objetivo: modulo de exames com rastreamento de status e baixa automatica de insumos de coleta no estoque.</w:t>
+      </w:r>
+    </w:p>
+    <w:p>
+      <w:pPr>
+        <w:spacing w:after="0" w:before="80"/>
+      </w:pPr>
+    </w:p>
+    <w:tbl>
+      <w:tblPr>
+        <w:tblW w:type="dxa" w:w="9360"/>
+        <w:tblBorders>
+          <w:top w:val="single" w:color="auto" w:sz="4"/>
+          <w:left w:val="single" w:color="auto" w:sz="4"/>
+          <w:bottom w:val="single" w:color="auto" w:sz="4"/>
+          <w:right w:val="single" w:color="auto" w:sz="4"/>
+          <w:insideH w:val="single" w:color="auto" w:sz="4"/>
+          <w:insideV w:val="single" w:color="auto" w:sz="4"/>
+        </w:tblBorders>
+      </w:tblPr>
+      <w:tblGrid>
+        <w:gridCol w:w="4680"/>
+        <w:gridCol w:w="4680"/>
+      </w:tblGrid>
+      <w:tr>
+        <w:trPr>
+          <w:tblHeader/>
+        </w:trPr>
+        <w:tc>
+          <w:tcPr>
+            <w:tcW w:type="dxa" w:w="4680"/>
+            <w:tcBorders>
+              <w:top w:val="single" w:color="CCCCCC" w:sz="1"/>
+              <w:left w:val="single" w:color="CCCCCC" w:sz="1"/>
+              <w:bottom w:val="single" w:color="CCCCCC" w:sz="1"/>
+              <w:right w:val="single" w:color="CCCCCC" w:sz="1"/>
+            </w:tcBorders>
+            <w:shd w:fill="185FA5" w:val="clear"/>
+            <w:tcMar>
+              <w:top w:type="dxa" w:w="80"/>
+              <w:left w:type="dxa" w:w="120"/>
+              <w:bottom w:type="dxa" w:w="80"/>
+              <w:right w:type="dxa" w:w="120"/>
+            </w:tcMar>
+          </w:tcPr>
+          <w:p>
+            <w:pPr>
+              <w:jc w:val="center"/>
+            </w:pPr>
+            <w:r>
+              <w:rPr>
+                <w:rFonts w:ascii="Arial" w:cs="Arial" w:eastAsia="Arial" w:hAnsi="Arial"/>
+                <w:b/>
+                <w:bCs/>
+                <w:color w:val="FFFFFF"/>
+                <w:sz w:val="20"/>
+                <w:szCs w:val="20"/>
+              </w:rPr>
+              <w:t xml:space="preserve">Dev 1 - Marco Tulio  (Back / DB)</w:t>
+            </w:r>
+          </w:p>
+        </w:tc>
+        <w:tc>
+          <w:tcPr>
+            <w:tcW w:type="dxa" w:w="4680"/>
+            <w:tcBorders>
+              <w:top w:val="single" w:color="CCCCCC" w:sz="1"/>
+              <w:left w:val="single" w:color="CCCCCC" w:sz="1"/>
+              <w:bottom w:val="single" w:color="CCCCCC" w:sz="1"/>
+              <w:right w:val="single" w:color="CCCCCC" w:sz="1"/>
+            </w:tcBorders>
+            <w:shd w:fill="117A65" w:val="clear"/>
+            <w:tcMar>
+              <w:top w:type="dxa" w:w="80"/>
+              <w:left w:type="dxa" w:w="120"/>
+              <w:bottom w:type="dxa" w:w="80"/>
+              <w:right w:type="dxa" w:w="120"/>
+            </w:tcMar>
+          </w:tcPr>
+          <w:p>
+            <w:pPr>
+              <w:jc w:val="center"/>
+            </w:pPr>
+            <w:r>
+              <w:rPr>
+                <w:rFonts w:ascii="Arial" w:cs="Arial" w:eastAsia="Arial" w:hAnsi="Arial"/>
+                <w:b/>
+                <w:bCs/>
+                <w:color w:val="FFFFFF"/>
+                <w:sz w:val="20"/>
+                <w:szCs w:val="20"/>
+              </w:rPr>
+              <w:t xml:space="preserve">Dev 2 - Joao Paiva  (UI / Back)</w:t>
+            </w:r>
+          </w:p>
+        </w:tc>
+      </w:tr>
+      <w:tr>
+        <w:tc>
+          <w:tcPr>
+            <w:tcW w:type="dxa" w:w="4680"/>
+            <w:tcBorders>
+              <w:top w:val="single" w:color="CCCCCC" w:sz="1"/>
+              <w:left w:val="single" w:color="CCCCCC" w:sz="1"/>
+              <w:bottom w:val="single" w:color="CCCCCC" w:sz="1"/>
+              <w:right w:val="single" w:color="CCCCCC" w:sz="1"/>
+            </w:tcBorders>
+            <w:shd w:fill="EBF5FB" w:val="clear"/>
+            <w:tcMar>
+              <w:top w:type="dxa" w:w="80"/>
+              <w:left w:type="dxa" w:w="120"/>
+              <w:bottom w:type="dxa" w:w="80"/>
+              <w:right w:type="dxa" w:w="80"/>
+            </w:tcMar>
+          </w:tcPr>
+          <w:p>
+            <w:r>
+              <w:rPr>
+                <w:rFonts w:ascii="Arial" w:cs="Arial" w:eastAsia="Arial" w:hAnsi="Arial"/>
+                <w:sz w:val="20"/>
+                <w:szCs w:val="20"/>
+              </w:rPr>
+              <w:t xml:space="preserve">-&gt; Schema MS3: exams (status: Coletado &gt; Em Analise &gt; Resultado Disponivel, RF-EXM-004)</w:t>
+            </w:r>
+          </w:p>
+        </w:tc>
+        <w:tc>
+          <w:tcPr>
+            <w:tcW w:type="dxa" w:w="4680"/>
+            <w:tcBorders>
+              <w:top w:val="single" w:color="CCCCCC" w:sz="1"/>
+              <w:left w:val="single" w:color="CCCCCC" w:sz="1"/>
+              <w:bottom w:val="single" w:color="CCCCCC" w:sz="1"/>
+              <w:right w:val="single" w:color="CCCCCC" w:sz="1"/>
+            </w:tcBorders>
+            <w:shd w:fill="EAFAF1" w:val="clear"/>
+            <w:tcMar>
+              <w:top w:type="dxa" w:w="80"/>
+              <w:left w:type="dxa" w:w="120"/>
+              <w:bottom w:type="dxa" w:w="80"/>
+              <w:right w:type="dxa" w:w="80"/>
+            </w:tcMar>
+          </w:tcPr>
+          <w:p>
+            <w:r>
+              <w:rPr>
+                <w:rFonts w:ascii="Arial" w:cs="Arial" w:eastAsia="Arial" w:hAnsi="Arial"/>
+                <w:sz w:val="20"/>
+                <w:szCs w:val="20"/>
+              </w:rPr>
+              <w:t xml:space="preserve">-&gt; Controllers MS3: Exam (Zod)</w:t>
+            </w:r>
+          </w:p>
+        </w:tc>
+      </w:tr>
+      <w:tr>
+        <w:tc>
+          <w:tcPr>
+            <w:tcW w:type="dxa" w:w="4680"/>
+            <w:tcBorders>
+              <w:top w:val="single" w:color="CCCCCC" w:sz="1"/>
+              <w:left w:val="single" w:color="CCCCCC" w:sz="1"/>
+              <w:bottom w:val="single" w:color="CCCCCC" w:sz="1"/>
+              <w:right w:val="single" w:color="CCCCCC" w:sz="1"/>
+            </w:tcBorders>
+            <w:shd w:fill="EBF5FB" w:val="clear"/>
+            <w:tcMar>
+              <w:top w:type="dxa" w:w="80"/>
+              <w:left w:type="dxa" w:w="120"/>
+              <w:bottom w:type="dxa" w:w="80"/>
+              <w:right w:type="dxa" w:w="80"/>
+            </w:tcMar>
+          </w:tcPr>
+          <w:p>
+            <w:r>
+              <w:rPr>
+                <w:rFonts w:ascii="Arial" w:cs="Arial" w:eastAsia="Arial" w:hAnsi="Arial"/>
+                <w:sz w:val="20"/>
+                <w:szCs w:val="20"/>
+              </w:rPr>
+              <w:t xml:space="preserve">-&gt; ExamService: selecao multipla de animais dentro de uma propriedade (RF-EXM-003), campos especificos por protocolo (RF-EXM-002)</w:t>
+            </w:r>
+          </w:p>
+        </w:tc>
+        <w:tc>
+          <w:tcPr>
+            <w:tcW w:type="dxa" w:w="4680"/>
+            <w:tcBorders>
+              <w:top w:val="single" w:color="CCCCCC" w:sz="1"/>
+              <w:left w:val="single" w:color="CCCCCC" w:sz="1"/>
+              <w:bottom w:val="single" w:color="CCCCCC" w:sz="1"/>
+              <w:right w:val="single" w:color="CCCCCC" w:sz="1"/>
+            </w:tcBorders>
+            <w:shd w:fill="EAFAF1" w:val="clear"/>
+            <w:tcMar>
+              <w:top w:type="dxa" w:w="80"/>
+              <w:left w:type="dxa" w:w="120"/>
+              <w:bottom w:type="dxa" w:w="80"/>
+              <w:right w:type="dxa" w:w="80"/>
+            </w:tcMar>
+          </w:tcPr>
+          <w:p>
+            <w:r>
+              <w:rPr>
+                <w:rFonts w:ascii="Arial" w:cs="Arial" w:eastAsia="Arial" w:hAnsi="Arial"/>
+                <w:sz w:val="20"/>
+                <w:szCs w:val="20"/>
+              </w:rPr>
+              <w:t xml:space="preserve">-&gt; Tela Exames: solicitacao com tipo de exame, material coletado, data de coleta, animal(is)/lote, propriedade e proprietario (RF-EXM-001)</w:t>
+            </w:r>
+          </w:p>
+        </w:tc>
+      </w:tr>
+      <w:tr>
+        <w:tc>
+          <w:tcPr>
+            <w:tcW w:type="dxa" w:w="4680"/>
+            <w:tcBorders>
+              <w:top w:val="single" w:color="CCCCCC" w:sz="1"/>
+              <w:left w:val="single" w:color="CCCCCC" w:sz="1"/>
+              <w:bottom w:val="single" w:color="CCCCCC" w:sz="1"/>
+              <w:right w:val="single" w:color="CCCCCC" w:sz="1"/>
+            </w:tcBorders>
+            <w:shd w:fill="EBF5FB" w:val="clear"/>
+            <w:tcMar>
+              <w:top w:type="dxa" w:w="80"/>
+              <w:left w:type="dxa" w:w="120"/>
+              <w:bottom w:type="dxa" w:w="80"/>
+              <w:right w:type="dxa" w:w="80"/>
+            </w:tcMar>
+          </w:tcPr>
+          <w:p>
+            <w:r>
+              <w:rPr>
+                <w:rFonts w:ascii="Arial" w:cs="Arial" w:eastAsia="Arial" w:hAnsi="Arial"/>
+                <w:sz w:val="20"/>
+                <w:szCs w:val="20"/>
+              </w:rPr>
+              <w:t xml:space="preserve">-&gt; Calculo de custo do exame: procedimento + insumos (baixa de estoque sem custo, RF-EXM-006) + mao de obra + km</w:t>
+            </w:r>
+          </w:p>
+        </w:tc>
+        <w:tc>
+          <w:tcPr>
+            <w:tcW w:type="dxa" w:w="4680"/>
+            <w:tcBorders>
+              <w:top w:val="single" w:color="CCCCCC" w:sz="1"/>
+              <w:left w:val="single" w:color="CCCCCC" w:sz="1"/>
+              <w:bottom w:val="single" w:color="CCCCCC" w:sz="1"/>
+              <w:right w:val="single" w:color="CCCCCC" w:sz="1"/>
+            </w:tcBorders>
+            <w:shd w:fill="EAFAF1" w:val="clear"/>
+            <w:tcMar>
+              <w:top w:type="dxa" w:w="80"/>
+              <w:left w:type="dxa" w:w="120"/>
+              <w:bottom w:type="dxa" w:w="80"/>
+              <w:right w:type="dxa" w:w="80"/>
+            </w:tcMar>
+          </w:tcPr>
+          <w:p>
+            <w:r>
+              <w:rPr>
+                <w:rFonts w:ascii="Arial" w:cs="Arial" w:eastAsia="Arial" w:hAnsi="Arial"/>
+                <w:sz w:val="20"/>
+                <w:szCs w:val="20"/>
+              </w:rPr>
+              <w:t xml:space="preserve">-&gt; Suporte a exames com protocolos especiais, incluindo Mormo e AIE</w:t>
+            </w:r>
+          </w:p>
+        </w:tc>
+      </w:tr>
+      <w:tr>
+        <w:tc>
+          <w:tcPr>
+            <w:tcW w:type="dxa" w:w="4680"/>
+            <w:tcBorders>
+              <w:top w:val="single" w:color="CCCCCC" w:sz="1"/>
+              <w:left w:val="single" w:color="CCCCCC" w:sz="1"/>
+              <w:bottom w:val="single" w:color="CCCCCC" w:sz="1"/>
+              <w:right w:val="single" w:color="CCCCCC" w:sz="1"/>
+            </w:tcBorders>
+            <w:shd w:fill="EBF5FB" w:val="clear"/>
+            <w:tcMar>
+              <w:top w:type="dxa" w:w="80"/>
+              <w:left w:type="dxa" w:w="120"/>
+              <w:bottom w:type="dxa" w:w="80"/>
+              <w:right w:type="dxa" w:w="80"/>
+            </w:tcMar>
+          </w:tcPr>
+          <w:p>
+            <w:r>
+              <w:rPr>
+                <w:rFonts w:ascii="Arial" w:cs="Arial" w:eastAsia="Arial" w:hAnsi="Arial"/>
+                <w:sz w:val="20"/>
+                <w:szCs w:val="20"/>
+              </w:rPr>
+              <w:t xml:space="preserve">-&gt; Consumo de insumos de coleta gera baixa automatica de estoque via broker (RN-003)</w:t>
+            </w:r>
+          </w:p>
+        </w:tc>
+        <w:tc>
+          <w:tcPr>
+            <w:tcW w:type="dxa" w:w="4680"/>
+            <w:tcBorders>
+              <w:top w:val="single" w:color="CCCCCC" w:sz="1"/>
+              <w:left w:val="single" w:color="CCCCCC" w:sz="1"/>
+              <w:bottom w:val="single" w:color="CCCCCC" w:sz="1"/>
+              <w:right w:val="single" w:color="CCCCCC" w:sz="1"/>
+            </w:tcBorders>
+            <w:shd w:fill="EAFAF1" w:val="clear"/>
+            <w:tcMar>
+              <w:top w:type="dxa" w:w="80"/>
+              <w:left w:type="dxa" w:w="120"/>
+              <w:bottom w:type="dxa" w:w="80"/>
+              <w:right w:type="dxa" w:w="80"/>
+            </w:tcMar>
+          </w:tcPr>
+          <w:p>
+            <w:r>
+              <w:rPr>
+                <w:rFonts w:ascii="Arial" w:cs="Arial" w:eastAsia="Arial" w:hAnsi="Arial"/>
+                <w:sz w:val="20"/>
+                <w:szCs w:val="20"/>
+              </w:rPr>
+              <w:t xml:space="preserve">-&gt; Upload de PDF com laudo/resultado do exame (RF-EXM-005)</w:t>
+            </w:r>
+          </w:p>
+        </w:tc>
+      </w:tr>
+      <w:tr>
+        <w:tc>
+          <w:tcPr>
+            <w:tcW w:type="dxa" w:w="4680"/>
+            <w:tcBorders>
+              <w:top w:val="single" w:color="CCCCCC" w:sz="1"/>
+              <w:left w:val="single" w:color="CCCCCC" w:sz="1"/>
+              <w:bottom w:val="single" w:color="CCCCCC" w:sz="1"/>
+              <w:right w:val="single" w:color="CCCCCC" w:sz="1"/>
+            </w:tcBorders>
+            <w:shd w:fill="EBF5FB" w:val="clear"/>
+            <w:tcMar>
+              <w:top w:type="dxa" w:w="80"/>
+              <w:left w:type="dxa" w:w="120"/>
+              <w:bottom w:type="dxa" w:w="80"/>
+              <w:right w:type="dxa" w:w="80"/>
+            </w:tcMar>
+          </w:tcPr>
+          <w:p>
+            <w:r>
+              <w:rPr>
+                <w:rFonts w:ascii="Arial" w:cs="Arial" w:eastAsia="Arial" w:hAnsi="Arial"/>
+                <w:sz w:val="20"/>
+                <w:szCs w:val="20"/>
+              </w:rPr>
+              <w:t xml:space="preserve">-&gt; ExamRepository (RLS, soft delete)</w:t>
+            </w:r>
+          </w:p>
+        </w:tc>
+        <w:tc>
+          <w:tcPr>
+            <w:tcW w:type="dxa" w:w="4680"/>
+            <w:tcBorders>
+              <w:top w:val="single" w:color="CCCCCC" w:sz="1"/>
+              <w:left w:val="single" w:color="CCCCCC" w:sz="1"/>
+              <w:bottom w:val="single" w:color="CCCCCC" w:sz="1"/>
+              <w:right w:val="single" w:color="CCCCCC" w:sz="1"/>
+            </w:tcBorders>
+            <w:shd w:fill="EAFAF1" w:val="clear"/>
+            <w:tcMar>
+              <w:top w:type="dxa" w:w="80"/>
+              <w:left w:type="dxa" w:w="120"/>
+              <w:bottom w:type="dxa" w:w="80"/>
+              <w:right w:type="dxa" w:w="80"/>
+            </w:tcMar>
+          </w:tcPr>
+          <w:p>
+            <w:r>
+              <w:rPr>
+                <w:rFonts w:ascii="Arial" w:cs="Arial" w:eastAsia="Arial" w:hAnsi="Arial"/>
+                <w:sz w:val="20"/>
+                <w:szCs w:val="20"/>
+              </w:rPr>
+              <w:t xml:space="preserve">-&gt; Indicador visual de status do exame (Coletado &gt; Em Analise &gt; Resultado Disponivel)</w:t>
+            </w:r>
+          </w:p>
+        </w:tc>
+      </w:tr>
+      <w:tr>
+        <w:tc>
+          <w:tcPr>
+            <w:tcW w:type="dxa" w:w="4680"/>
+            <w:tcBorders>
+              <w:top w:val="single" w:color="CCCCCC" w:sz="1"/>
+              <w:left w:val="single" w:color="CCCCCC" w:sz="1"/>
+              <w:bottom w:val="single" w:color="CCCCCC" w:sz="1"/>
+              <w:right w:val="single" w:color="CCCCCC" w:sz="1"/>
+            </w:tcBorders>
+            <w:shd w:fill="EBF5FB" w:val="clear"/>
+            <w:tcMar>
+              <w:top w:type="dxa" w:w="80"/>
+              <w:left w:type="dxa" w:w="120"/>
+              <w:bottom w:type="dxa" w:w="80"/>
+              <w:right w:type="dxa" w:w="80"/>
+            </w:tcMar>
+          </w:tcPr>
+          <w:p>
+            <w:r>
+              <w:rPr>
+                <w:rFonts w:ascii="Arial" w:cs="Arial" w:eastAsia="Arial" w:hAnsi="Arial"/>
+                <w:sz w:val="20"/>
+                <w:szCs w:val="20"/>
+              </w:rPr>
+              <w:t xml:space="preserve">-&gt; Testes unitarios: ExamService (&gt;=70%)</w:t>
+            </w:r>
+          </w:p>
+        </w:tc>
+        <w:tc>
+          <w:tcPr>
+            <w:tcW w:type="dxa" w:w="4680"/>
+            <w:tcBorders>
+              <w:top w:val="single" w:color="CCCCCC" w:sz="1"/>
+              <w:left w:val="single" w:color="CCCCCC" w:sz="1"/>
+              <w:bottom w:val="single" w:color="CCCCCC" w:sz="1"/>
+              <w:right w:val="single" w:color="CCCCCC" w:sz="1"/>
+            </w:tcBorders>
+            <w:shd w:fill="EAFAF1" w:val="clear"/>
+            <w:tcMar>
+              <w:top w:type="dxa" w:w="80"/>
+              <w:left w:type="dxa" w:w="120"/>
+              <w:bottom w:type="dxa" w:w="80"/>
+              <w:right w:type="dxa" w:w="80"/>
+            </w:tcMar>
+          </w:tcPr>
+          <w:p>
+            <w:r>
+              <w:rPr>
+                <w:rFonts w:ascii="Arial" w:cs="Arial" w:eastAsia="Arial" w:hAnsi="Arial"/>
+                <w:sz w:val="20"/>
+                <w:szCs w:val="20"/>
+              </w:rPr>
+              <w:t xml:space="preserve">-&gt; Placeholder de notificacao de atualizacao de status de exame (RF-NOT-002 -- integra de verdade quando o MS de Notification existir)</w:t>
+            </w:r>
+          </w:p>
+        </w:tc>
+      </w:tr>
+      <w:tr>
+        <w:tc>
+          <w:tcPr>
+            <w:tcW w:type="dxa" w:w="4680"/>
+            <w:tcBorders>
+              <w:top w:val="single" w:color="CCCCCC" w:sz="1"/>
+              <w:left w:val="single" w:color="CCCCCC" w:sz="1"/>
+              <w:bottom w:val="single" w:color="CCCCCC" w:sz="1"/>
+              <w:right w:val="single" w:color="CCCCCC" w:sz="1"/>
+            </w:tcBorders>
+            <w:shd w:fill="EBF5FB" w:val="clear"/>
+            <w:tcMar>
+              <w:top w:type="dxa" w:w="80"/>
+              <w:left w:type="dxa" w:w="120"/>
+              <w:bottom w:type="dxa" w:w="80"/>
+              <w:right w:type="dxa" w:w="80"/>
+            </w:tcMar>
+          </w:tcPr>
+          <w:p>
+            <w:r>
+              <w:rPr>
+                <w:rFonts w:ascii="Arial" w:cs="Arial" w:eastAsia="Arial" w:hAnsi="Arial"/>
+                <w:sz w:val="20"/>
+                <w:szCs w:val="20"/>
+              </w:rPr>
+              <w:t xml:space="preserve">-&gt; Publicar IExamService em packages/shared-types</w:t>
+            </w:r>
+          </w:p>
+        </w:tc>
+        <w:tc>
+          <w:tcPr>
+            <w:tcW w:type="dxa" w:w="4680"/>
+            <w:tcBorders>
+              <w:top w:val="single" w:color="CCCCCC" w:sz="1"/>
+              <w:left w:val="single" w:color="CCCCCC" w:sz="1"/>
+              <w:bottom w:val="single" w:color="CCCCCC" w:sz="1"/>
+              <w:right w:val="single" w:color="CCCCCC" w:sz="1"/>
+            </w:tcBorders>
+            <w:shd w:fill="EAFAF1" w:val="clear"/>
+            <w:tcMar>
+              <w:top w:type="dxa" w:w="80"/>
+              <w:left w:type="dxa" w:w="120"/>
+              <w:bottom w:type="dxa" w:w="80"/>
+              <w:right w:type="dxa" w:w="80"/>
+            </w:tcMar>
+          </w:tcPr>
+          <w:p>
+            <w:r>
+              <w:rPr>
+                <w:rFonts w:ascii="Arial" w:cs="Arial" w:eastAsia="Arial" w:hAnsi="Arial"/>
+                <w:sz w:val="20"/>
+                <w:szCs w:val="20"/>
+              </w:rPr>
+              <w:t xml:space="preserve">-&gt; Testes E2E: fluxo de solicitacao de exame ate upload de laudo</w:t>
+            </w:r>
+          </w:p>
+        </w:tc>
+      </w:tr>
+    </w:tbl>
+    <w:p>
+      <w:pPr>
+        <w:spacing w:after="0" w:before="80"/>
+      </w:pPr>
+    </w:p>
+    <w:tbl>
+      <w:tblPr>
+        <w:tblW w:type="dxa" w:w="9360"/>
+        <w:tblBorders>
+          <w:top w:val="single" w:color="auto" w:sz="4"/>
+          <w:left w:val="single" w:color="auto" w:sz="4"/>
+          <w:bottom w:val="single" w:color="auto" w:sz="4"/>
+          <w:right w:val="single" w:color="auto" w:sz="4"/>
+          <w:insideH w:val="single" w:color="auto" w:sz="4"/>
+          <w:insideV w:val="single" w:color="auto" w:sz="4"/>
+        </w:tblBorders>
+      </w:tblPr>
+      <w:tblGrid>
+        <w:gridCol w:w="9360"/>
+      </w:tblGrid>
+      <w:tr>
+        <w:tc>
+          <w:tcPr>
+            <w:tcBorders>
+              <w:top w:val="single" w:color="117A65" w:sz="8"/>
+              <w:left w:val="single" w:color="117A65" w:sz="8"/>
+              <w:bottom w:val="single" w:color="CCCCCC" w:sz="1"/>
+              <w:right w:val="single" w:color="CCCCCC" w:sz="1"/>
+            </w:tcBorders>
+            <w:shd w:fill="EAFAF1" w:val="clear"/>
+            <w:tcMar>
+              <w:top w:type="dxa" w:w="120"/>
+              <w:left w:type="dxa" w:w="220"/>
+              <w:bottom w:type="dxa" w:w="120"/>
+              <w:right w:type="dxa" w:w="220"/>
+            </w:tcMar>
+          </w:tcPr>
+          <w:p>
+            <w:r>
+              <w:rPr>
+                <w:rFonts w:ascii="Arial" w:cs="Arial" w:eastAsia="Arial" w:hAnsi="Arial"/>
+                <w:b/>
+                <w:bCs/>
+                <w:color w:val="117A65"/>
+                <w:sz w:val="21"/>
+                <w:szCs w:val="21"/>
+              </w:rPr>
+              <w:t xml:space="preserve">Entregavel Sprint 6</w:t>
+            </w:r>
+          </w:p>
+          <w:p>
+            <w:pPr>
+              <w:spacing w:after="0" w:before="40"/>
+            </w:pPr>
+            <w:r>
+              <w:rPr>
+                <w:rFonts w:ascii="Arial" w:cs="Arial" w:eastAsia="Arial" w:hAnsi="Arial"/>
+                <w:sz w:val="20"/>
+                <w:szCs w:val="20"/>
+              </w:rPr>
+              <w:t xml:space="preserve">Modulo de exames completo, incluindo Mormo e AIE. Status rastreavel em 3 etapas, laudo anexavel em PDF.</w:t>
+            </w:r>
+          </w:p>
+        </w:tc>
+      </w:tr>
+    </w:tbl>
+    <w:p>
+      <w:pPr>
+        <w:spacing w:after="0" w:before="80"/>
+      </w:pPr>
+    </w:p>
+    <w:p>
+      <w:pPr>
+        <w:pStyle w:val="Heading2"/>
+        <w:spacing w:after="100" w:before="260"/>
+      </w:pPr>
+      <w:r>
+        <w:rPr>
+          <w:rFonts w:ascii="Arial" w:cs="Arial" w:eastAsia="Arial" w:hAnsi="Arial"/>
+          <w:b/>
+          <w:bCs/>
+          <w:color w:val="1D9E75"/>
+          <w:sz w:val="26"/>
+          <w:szCs w:val="26"/>
+        </w:rPr>
+        <w:t xml:space="preserve">Sprint 7 -- Semanas 13 e 14: Vacinacao (MS3)</w:t>
+      </w:r>
+    </w:p>
+    <w:p>
+      <w:pPr>
+        <w:spacing w:after="80" w:before="80" w:line="340"/>
+        <w:jc w:val="both"/>
+      </w:pPr>
+      <w:r>
+        <w:rPr>
+          <w:rFonts w:ascii="Arial" w:cs="Arial" w:eastAsia="Arial" w:hAnsi="Arial"/>
+          <w:color w:val="666666"/>
+          <w:sz w:val="22"/>
+          <w:szCs w:val="22"/>
+        </w:rPr>
+        <w:t xml:space="preserve">Objetivo: modulo de vacinacao com baixa automatica de estoque e alertas configuraveis de re-vacinacao.</w:t>
+      </w:r>
+    </w:p>
+    <w:p>
+      <w:pPr>
+        <w:spacing w:after="0" w:before="80"/>
+      </w:pPr>
+    </w:p>
+    <w:tbl>
+      <w:tblPr>
+        <w:tblW w:type="dxa" w:w="9360"/>
+        <w:tblBorders>
+          <w:top w:val="single" w:color="auto" w:sz="4"/>
+          <w:left w:val="single" w:color="auto" w:sz="4"/>
+          <w:bottom w:val="single" w:color="auto" w:sz="4"/>
+          <w:right w:val="single" w:color="auto" w:sz="4"/>
+          <w:insideH w:val="single" w:color="auto" w:sz="4"/>
+          <w:insideV w:val="single" w:color="auto" w:sz="4"/>
+        </w:tblBorders>
+      </w:tblPr>
+      <w:tblGrid>
+        <w:gridCol w:w="4680"/>
+        <w:gridCol w:w="4680"/>
+      </w:tblGrid>
+      <w:tr>
+        <w:trPr>
+          <w:tblHeader/>
+        </w:trPr>
+        <w:tc>
+          <w:tcPr>
+            <w:tcW w:type="dxa" w:w="4680"/>
+            <w:tcBorders>
+              <w:top w:val="single" w:color="CCCCCC" w:sz="1"/>
+              <w:left w:val="single" w:color="CCCCCC" w:sz="1"/>
+              <w:bottom w:val="single" w:color="CCCCCC" w:sz="1"/>
+              <w:right w:val="single" w:color="CCCCCC" w:sz="1"/>
+            </w:tcBorders>
+            <w:shd w:fill="185FA5" w:val="clear"/>
+            <w:tcMar>
+              <w:top w:type="dxa" w:w="80"/>
+              <w:left w:type="dxa" w:w="120"/>
+              <w:bottom w:type="dxa" w:w="80"/>
+              <w:right w:type="dxa" w:w="120"/>
+            </w:tcMar>
+          </w:tcPr>
+          <w:p>
+            <w:pPr>
+              <w:jc w:val="center"/>
+            </w:pPr>
+            <w:r>
+              <w:rPr>
+                <w:rFonts w:ascii="Arial" w:cs="Arial" w:eastAsia="Arial" w:hAnsi="Arial"/>
+                <w:b/>
+                <w:bCs/>
+                <w:color w:val="FFFFFF"/>
+                <w:sz w:val="20"/>
+                <w:szCs w:val="20"/>
+              </w:rPr>
+              <w:t xml:space="preserve">Dev 1 - Marco Tulio  (Back / DB)</w:t>
+            </w:r>
+          </w:p>
+        </w:tc>
+        <w:tc>
+          <w:tcPr>
+            <w:tcW w:type="dxa" w:w="4680"/>
+            <w:tcBorders>
+              <w:top w:val="single" w:color="CCCCCC" w:sz="1"/>
+              <w:left w:val="single" w:color="CCCCCC" w:sz="1"/>
+              <w:bottom w:val="single" w:color="CCCCCC" w:sz="1"/>
+              <w:right w:val="single" w:color="CCCCCC" w:sz="1"/>
+            </w:tcBorders>
+            <w:shd w:fill="117A65" w:val="clear"/>
+            <w:tcMar>
+              <w:top w:type="dxa" w:w="80"/>
+              <w:left w:type="dxa" w:w="120"/>
+              <w:bottom w:type="dxa" w:w="80"/>
+              <w:right w:type="dxa" w:w="120"/>
+            </w:tcMar>
+          </w:tcPr>
+          <w:p>
+            <w:pPr>
+              <w:jc w:val="center"/>
+            </w:pPr>
+            <w:r>
+              <w:rPr>
+                <w:rFonts w:ascii="Arial" w:cs="Arial" w:eastAsia="Arial" w:hAnsi="Arial"/>
+                <w:b/>
+                <w:bCs/>
+                <w:color w:val="FFFFFF"/>
+                <w:sz w:val="20"/>
+                <w:szCs w:val="20"/>
+              </w:rPr>
+              <w:t xml:space="preserve">Dev 2 - Joao Paiva  (UI / Back)</w:t>
+            </w:r>
+          </w:p>
+        </w:tc>
+      </w:tr>
+      <w:tr>
+        <w:tc>
+          <w:tcPr>
+            <w:tcW w:type="dxa" w:w="4680"/>
+            <w:tcBorders>
+              <w:top w:val="single" w:color="CCCCCC" w:sz="1"/>
+              <w:left w:val="single" w:color="CCCCCC" w:sz="1"/>
+              <w:bottom w:val="single" w:color="CCCCCC" w:sz="1"/>
+              <w:right w:val="single" w:color="CCCCCC" w:sz="1"/>
+            </w:tcBorders>
+            <w:shd w:fill="EBF5FB" w:val="clear"/>
+            <w:tcMar>
+              <w:top w:type="dxa" w:w="80"/>
+              <w:left w:type="dxa" w:w="120"/>
+              <w:bottom w:type="dxa" w:w="80"/>
+              <w:right w:type="dxa" w:w="80"/>
+            </w:tcMar>
+          </w:tcPr>
+          <w:p>
+            <w:r>
+              <w:rPr>
+                <w:rFonts w:ascii="Arial" w:cs="Arial" w:eastAsia="Arial" w:hAnsi="Arial"/>
+                <w:sz w:val="20"/>
+                <w:szCs w:val="20"/>
+              </w:rPr>
+              <w:t xml:space="preserve">-&gt; Schema MS3: vaccinations (vinculo com produto do estoque, animal individual ou multiplo, RF-VAC-001)</w:t>
+            </w:r>
+          </w:p>
+        </w:tc>
+        <w:tc>
+          <w:tcPr>
+            <w:tcW w:type="dxa" w:w="4680"/>
+            <w:tcBorders>
+              <w:top w:val="single" w:color="CCCCCC" w:sz="1"/>
+              <w:left w:val="single" w:color="CCCCCC" w:sz="1"/>
+              <w:bottom w:val="single" w:color="CCCCCC" w:sz="1"/>
+              <w:right w:val="single" w:color="CCCCCC" w:sz="1"/>
+            </w:tcBorders>
+            <w:shd w:fill="EAFAF1" w:val="clear"/>
+            <w:tcMar>
+              <w:top w:type="dxa" w:w="80"/>
+              <w:left w:type="dxa" w:w="120"/>
+              <w:bottom w:type="dxa" w:w="80"/>
+              <w:right w:type="dxa" w:w="80"/>
+            </w:tcMar>
+          </w:tcPr>
+          <w:p>
+            <w:r>
+              <w:rPr>
+                <w:rFonts w:ascii="Arial" w:cs="Arial" w:eastAsia="Arial" w:hAnsi="Arial"/>
+                <w:sz w:val="20"/>
+                <w:szCs w:val="20"/>
+              </w:rPr>
+              <w:t xml:space="preserve">-&gt; Controllers MS3: Vaccination (Zod)</w:t>
+            </w:r>
+          </w:p>
+        </w:tc>
+      </w:tr>
+      <w:tr>
+        <w:tc>
+          <w:tcPr>
+            <w:tcW w:type="dxa" w:w="4680"/>
+            <w:tcBorders>
+              <w:top w:val="single" w:color="CCCCCC" w:sz="1"/>
+              <w:left w:val="single" w:color="CCCCCC" w:sz="1"/>
+              <w:bottom w:val="single" w:color="CCCCCC" w:sz="1"/>
+              <w:right w:val="single" w:color="CCCCCC" w:sz="1"/>
+            </w:tcBorders>
+            <w:shd w:fill="EBF5FB" w:val="clear"/>
+            <w:tcMar>
+              <w:top w:type="dxa" w:w="80"/>
+              <w:left w:type="dxa" w:w="120"/>
+              <w:bottom w:type="dxa" w:w="80"/>
+              <w:right w:type="dxa" w:w="80"/>
+            </w:tcMar>
+          </w:tcPr>
+          <w:p>
+            <w:r>
+              <w:rPr>
+                <w:rFonts w:ascii="Arial" w:cs="Arial" w:eastAsia="Arial" w:hAnsi="Arial"/>
+                <w:sz w:val="20"/>
+                <w:szCs w:val="20"/>
+              </w:rPr>
+              <w:t xml:space="preserve">-&gt; VaccinationService: baixa automatica da quantidade de vacina do estoque (RF-VAC-002, RN-003)</w:t>
+            </w:r>
+          </w:p>
+        </w:tc>
+        <w:tc>
+          <w:tcPr>
+            <w:tcW w:type="dxa" w:w="4680"/>
+            <w:tcBorders>
+              <w:top w:val="single" w:color="CCCCCC" w:sz="1"/>
+              <w:left w:val="single" w:color="CCCCCC" w:sz="1"/>
+              <w:bottom w:val="single" w:color="CCCCCC" w:sz="1"/>
+              <w:right w:val="single" w:color="CCCCCC" w:sz="1"/>
+            </w:tcBorders>
+            <w:shd w:fill="EAFAF1" w:val="clear"/>
+            <w:tcMar>
+              <w:top w:type="dxa" w:w="80"/>
+              <w:left w:type="dxa" w:w="120"/>
+              <w:bottom w:type="dxa" w:w="80"/>
+              <w:right w:type="dxa" w:w="80"/>
+            </w:tcMar>
+          </w:tcPr>
+          <w:p>
+            <w:r>
+              <w:rPr>
+                <w:rFonts w:ascii="Arial" w:cs="Arial" w:eastAsia="Arial" w:hAnsi="Arial"/>
+                <w:sz w:val="20"/>
+                <w:szCs w:val="20"/>
+              </w:rPr>
+              <w:t xml:space="preserve">-&gt; Tela Vacinacao: individual ou selecao multipla de equinos (RF-VAC-001)</w:t>
+            </w:r>
+          </w:p>
+        </w:tc>
+      </w:tr>
+      <w:tr>
+        <w:tc>
+          <w:tcPr>
+            <w:tcW w:type="dxa" w:w="4680"/>
+            <w:tcBorders>
+              <w:top w:val="single" w:color="CCCCCC" w:sz="1"/>
+              <w:left w:val="single" w:color="CCCCCC" w:sz="1"/>
+              <w:bottom w:val="single" w:color="CCCCCC" w:sz="1"/>
+              <w:right w:val="single" w:color="CCCCCC" w:sz="1"/>
+            </w:tcBorders>
+            <w:shd w:fill="EBF5FB" w:val="clear"/>
+            <w:tcMar>
+              <w:top w:type="dxa" w:w="80"/>
+              <w:left w:type="dxa" w:w="120"/>
+              <w:bottom w:type="dxa" w:w="80"/>
+              <w:right w:type="dxa" w:w="80"/>
+            </w:tcMar>
+          </w:tcPr>
+          <w:p>
+            <w:r>
+              <w:rPr>
+                <w:rFonts w:ascii="Arial" w:cs="Arial" w:eastAsia="Arial" w:hAnsi="Arial"/>
+                <w:sz w:val="20"/>
+                <w:szCs w:val="20"/>
+              </w:rPr>
+              <w:t xml:space="preserve">-&gt; Calculo de custo: valor da vacina (do estoque) + mao de obra + km rodado (RF-VAC-003)</w:t>
+            </w:r>
+          </w:p>
+        </w:tc>
+        <w:tc>
+          <w:tcPr>
+            <w:tcW w:type="dxa" w:w="4680"/>
+            <w:tcBorders>
+              <w:top w:val="single" w:color="CCCCCC" w:sz="1"/>
+              <w:left w:val="single" w:color="CCCCCC" w:sz="1"/>
+              <w:bottom w:val="single" w:color="CCCCCC" w:sz="1"/>
+              <w:right w:val="single" w:color="CCCCCC" w:sz="1"/>
+            </w:tcBorders>
+            <w:shd w:fill="EAFAF1" w:val="clear"/>
+            <w:tcMar>
+              <w:top w:type="dxa" w:w="80"/>
+              <w:left w:type="dxa" w:w="120"/>
+              <w:bottom w:type="dxa" w:w="80"/>
+              <w:right w:type="dxa" w:w="80"/>
+            </w:tcMar>
+          </w:tcPr>
+          <w:p>
+            <w:r>
+              <w:rPr>
+                <w:rFonts w:ascii="Arial" w:cs="Arial" w:eastAsia="Arial" w:hAnsi="Arial"/>
+                <w:sz w:val="20"/>
+                <w:szCs w:val="20"/>
+              </w:rPr>
+              <w:t xml:space="preserve">-&gt; Historico de vacinacoes acessivel pela tela do animal (RF-VAC-004)</w:t>
+            </w:r>
+          </w:p>
+        </w:tc>
+      </w:tr>
+      <w:tr>
+        <w:tc>
+          <w:tcPr>
+            <w:tcW w:type="dxa" w:w="4680"/>
+            <w:tcBorders>
+              <w:top w:val="single" w:color="CCCCCC" w:sz="1"/>
+              <w:left w:val="single" w:color="CCCCCC" w:sz="1"/>
+              <w:bottom w:val="single" w:color="CCCCCC" w:sz="1"/>
+              <w:right w:val="single" w:color="CCCCCC" w:sz="1"/>
+            </w:tcBorders>
+            <w:shd w:fill="EBF5FB" w:val="clear"/>
+            <w:tcMar>
+              <w:top w:type="dxa" w:w="80"/>
+              <w:left w:type="dxa" w:w="120"/>
+              <w:bottom w:type="dxa" w:w="80"/>
+              <w:right w:type="dxa" w:w="80"/>
+            </w:tcMar>
+          </w:tcPr>
+          <w:p>
+            <w:r>
+              <w:rPr>
+                <w:rFonts w:ascii="Arial" w:cs="Arial" w:eastAsia="Arial" w:hAnsi="Arial"/>
+                <w:sz w:val="20"/>
+                <w:szCs w:val="20"/>
+              </w:rPr>
+              <w:t xml:space="preserve">-&gt; AlertService: alerta de re-vacinacao com base no intervalo de dose por vacina (RF-VAC-005)</w:t>
+            </w:r>
+          </w:p>
+        </w:tc>
+        <w:tc>
+          <w:tcPr>
+            <w:tcW w:type="dxa" w:w="4680"/>
+            <w:tcBorders>
+              <w:top w:val="single" w:color="CCCCCC" w:sz="1"/>
+              <w:left w:val="single" w:color="CCCCCC" w:sz="1"/>
+              <w:bottom w:val="single" w:color="CCCCCC" w:sz="1"/>
+              <w:right w:val="single" w:color="CCCCCC" w:sz="1"/>
+            </w:tcBorders>
+            <w:shd w:fill="EAFAF1" w:val="clear"/>
+            <w:tcMar>
+              <w:top w:type="dxa" w:w="80"/>
+              <w:left w:type="dxa" w:w="120"/>
+              <w:bottom w:type="dxa" w:w="80"/>
+              <w:right w:type="dxa" w:w="80"/>
+            </w:tcMar>
+          </w:tcPr>
+          <w:p>
+            <w:r>
+              <w:rPr>
+                <w:rFonts w:ascii="Arial" w:cs="Arial" w:eastAsia="Arial" w:hAnsi="Arial"/>
+                <w:sz w:val="20"/>
+                <w:szCs w:val="20"/>
+              </w:rPr>
+              <w:t xml:space="preserve">-&gt; Indicador visual de proxima dose / re-vacinacao pendente</w:t>
+            </w:r>
+          </w:p>
+        </w:tc>
+      </w:tr>
+      <w:tr>
+        <w:tc>
+          <w:tcPr>
+            <w:tcW w:type="dxa" w:w="4680"/>
+            <w:tcBorders>
+              <w:top w:val="single" w:color="CCCCCC" w:sz="1"/>
+              <w:left w:val="single" w:color="CCCCCC" w:sz="1"/>
+              <w:bottom w:val="single" w:color="CCCCCC" w:sz="1"/>
+              <w:right w:val="single" w:color="CCCCCC" w:sz="1"/>
+            </w:tcBorders>
+            <w:shd w:fill="EBF5FB" w:val="clear"/>
+            <w:tcMar>
+              <w:top w:type="dxa" w:w="80"/>
+              <w:left w:type="dxa" w:w="120"/>
+              <w:bottom w:type="dxa" w:w="80"/>
+              <w:right w:type="dxa" w:w="80"/>
+            </w:tcMar>
+          </w:tcPr>
+          <w:p>
+            <w:r>
+              <w:rPr>
+                <w:rFonts w:ascii="Arial" w:cs="Arial" w:eastAsia="Arial" w:hAnsi="Arial"/>
+                <w:sz w:val="20"/>
+                <w:szCs w:val="20"/>
+              </w:rPr>
+              <w:t xml:space="preserve">-&gt; VaccinationRepository (RLS, soft delete)</w:t>
+            </w:r>
+          </w:p>
+        </w:tc>
+        <w:tc>
+          <w:tcPr>
+            <w:tcW w:type="dxa" w:w="4680"/>
+            <w:tcBorders>
+              <w:top w:val="single" w:color="CCCCCC" w:sz="1"/>
+              <w:left w:val="single" w:color="CCCCCC" w:sz="1"/>
+              <w:bottom w:val="single" w:color="CCCCCC" w:sz="1"/>
+              <w:right w:val="single" w:color="CCCCCC" w:sz="1"/>
+            </w:tcBorders>
+            <w:shd w:fill="EAFAF1" w:val="clear"/>
+            <w:tcMar>
+              <w:top w:type="dxa" w:w="80"/>
+              <w:left w:type="dxa" w:w="120"/>
+              <w:bottom w:type="dxa" w:w="80"/>
+              <w:right w:type="dxa" w:w="80"/>
+            </w:tcMar>
+          </w:tcPr>
+          <w:p>
+            <w:r>
+              <w:rPr>
+                <w:rFonts w:ascii="Arial" w:cs="Arial" w:eastAsia="Arial" w:hAnsi="Arial"/>
+                <w:sz w:val="20"/>
+                <w:szCs w:val="20"/>
+              </w:rPr>
+              <w:t xml:space="preserve">-&gt; Configuracao de intervalo de dose por vacina (tela de configuracoes do produto)</w:t>
+            </w:r>
+          </w:p>
+        </w:tc>
+      </w:tr>
+      <w:tr>
+        <w:tc>
+          <w:tcPr>
+            <w:tcW w:type="dxa" w:w="4680"/>
+            <w:tcBorders>
+              <w:top w:val="single" w:color="CCCCCC" w:sz="1"/>
+              <w:left w:val="single" w:color="CCCCCC" w:sz="1"/>
+              <w:bottom w:val="single" w:color="CCCCCC" w:sz="1"/>
+              <w:right w:val="single" w:color="CCCCCC" w:sz="1"/>
+            </w:tcBorders>
+            <w:shd w:fill="EBF5FB" w:val="clear"/>
+            <w:tcMar>
+              <w:top w:type="dxa" w:w="80"/>
+              <w:left w:type="dxa" w:w="120"/>
+              <w:bottom w:type="dxa" w:w="80"/>
+              <w:right w:type="dxa" w:w="80"/>
+            </w:tcMar>
+          </w:tcPr>
+          <w:p>
+            <w:r>
+              <w:rPr>
+                <w:rFonts w:ascii="Arial" w:cs="Arial" w:eastAsia="Arial" w:hAnsi="Arial"/>
+                <w:sz w:val="20"/>
+                <w:szCs w:val="20"/>
+              </w:rPr>
+              <w:t xml:space="preserve">-&gt; Testes unitarios: VaccinationService e alerta de re-vacinacao (&gt;=70%)</w:t>
+            </w:r>
+          </w:p>
+        </w:tc>
+        <w:tc>
+          <w:tcPr>
+            <w:tcW w:type="dxa" w:w="4680"/>
+            <w:tcBorders>
+              <w:top w:val="single" w:color="CCCCCC" w:sz="1"/>
+              <w:left w:val="single" w:color="CCCCCC" w:sz="1"/>
+              <w:bottom w:val="single" w:color="CCCCCC" w:sz="1"/>
+              <w:right w:val="single" w:color="CCCCCC" w:sz="1"/>
+            </w:tcBorders>
+            <w:shd w:fill="EAFAF1" w:val="clear"/>
+            <w:tcMar>
+              <w:top w:type="dxa" w:w="80"/>
+              <w:left w:type="dxa" w:w="120"/>
+              <w:bottom w:type="dxa" w:w="80"/>
+              <w:right w:type="dxa" w:w="80"/>
+            </w:tcMar>
+          </w:tcPr>
+          <w:p>
+            <w:r>
+              <w:rPr>
+                <w:rFonts w:ascii="Arial" w:cs="Arial" w:eastAsia="Arial" w:hAnsi="Arial"/>
+                <w:sz w:val="20"/>
+                <w:szCs w:val="20"/>
+              </w:rPr>
+              <w:t xml:space="preserve">-&gt; Testes E2E: fluxo de vacinacao individual e multipla</w:t>
+            </w:r>
+          </w:p>
+        </w:tc>
+      </w:tr>
+      <w:tr>
+        <w:tc>
+          <w:tcPr>
+            <w:tcW w:type="dxa" w:w="4680"/>
+            <w:tcBorders>
+              <w:top w:val="single" w:color="CCCCCC" w:sz="1"/>
+              <w:left w:val="single" w:color="CCCCCC" w:sz="1"/>
+              <w:bottom w:val="single" w:color="CCCCCC" w:sz="1"/>
+              <w:right w:val="single" w:color="CCCCCC" w:sz="1"/>
+            </w:tcBorders>
+            <w:shd w:fill="EBF5FB" w:val="clear"/>
+            <w:tcMar>
+              <w:top w:type="dxa" w:w="80"/>
+              <w:left w:type="dxa" w:w="120"/>
+              <w:bottom w:type="dxa" w:w="80"/>
+              <w:right w:type="dxa" w:w="80"/>
+            </w:tcMar>
+          </w:tcPr>
+          <w:p>
+            <w:r>
+              <w:rPr>
+                <w:rFonts w:ascii="Arial" w:cs="Arial" w:eastAsia="Arial" w:hAnsi="Arial"/>
+                <w:sz w:val="20"/>
+                <w:szCs w:val="20"/>
+              </w:rPr>
+              <w:t xml:space="preserve">-&gt; Publicar IVaccinationService em packages/shared-types</w:t>
+            </w:r>
+          </w:p>
+        </w:tc>
+        <w:tc>
+          <w:tcPr>
+            <w:tcW w:type="dxa" w:w="4680"/>
+            <w:tcBorders>
+              <w:top w:val="single" w:color="CCCCCC" w:sz="1"/>
+              <w:left w:val="single" w:color="CCCCCC" w:sz="1"/>
+              <w:bottom w:val="single" w:color="CCCCCC" w:sz="1"/>
+              <w:right w:val="single" w:color="CCCCCC" w:sz="1"/>
+            </w:tcBorders>
+            <w:shd w:fill="EAFAF1" w:val="clear"/>
+            <w:tcMar>
+              <w:top w:type="dxa" w:w="80"/>
+              <w:left w:type="dxa" w:w="120"/>
+              <w:bottom w:type="dxa" w:w="80"/>
+              <w:right w:type="dxa" w:w="80"/>
+            </w:tcMar>
+          </w:tcPr>
+          <w:p>
+            <w:r>
+              <w:rPr>
+                <w:rFonts w:ascii="Arial" w:cs="Arial" w:eastAsia="Arial" w:hAnsi="Arial"/>
+                <w:sz w:val="20"/>
+                <w:szCs w:val="20"/>
+              </w:rPr>
+              <w:t xml:space="preserve">-&gt; Documentacao tecnica: README de MS3</w:t>
+            </w:r>
+          </w:p>
+        </w:tc>
+      </w:tr>
+    </w:tbl>
+    <w:p>
+      <w:pPr>
+        <w:spacing w:after="0" w:before="80"/>
+      </w:pPr>
+    </w:p>
+    <w:tbl>
+      <w:tblPr>
+        <w:tblW w:type="dxa" w:w="9360"/>
+        <w:tblBorders>
+          <w:top w:val="single" w:color="auto" w:sz="4"/>
+          <w:left w:val="single" w:color="auto" w:sz="4"/>
+          <w:bottom w:val="single" w:color="auto" w:sz="4"/>
+          <w:right w:val="single" w:color="auto" w:sz="4"/>
+          <w:insideH w:val="single" w:color="auto" w:sz="4"/>
+          <w:insideV w:val="single" w:color="auto" w:sz="4"/>
+        </w:tblBorders>
+      </w:tblPr>
+      <w:tblGrid>
+        <w:gridCol w:w="9360"/>
+      </w:tblGrid>
+      <w:tr>
+        <w:tc>
+          <w:tcPr>
+            <w:tcBorders>
+              <w:top w:val="single" w:color="117A65" w:sz="8"/>
+              <w:left w:val="single" w:color="117A65" w:sz="8"/>
+              <w:bottom w:val="single" w:color="CCCCCC" w:sz="1"/>
+              <w:right w:val="single" w:color="CCCCCC" w:sz="1"/>
+            </w:tcBorders>
+            <w:shd w:fill="EAFAF1" w:val="clear"/>
+            <w:tcMar>
+              <w:top w:type="dxa" w:w="120"/>
+              <w:left w:type="dxa" w:w="220"/>
+              <w:bottom w:type="dxa" w:w="120"/>
+              <w:right w:type="dxa" w:w="220"/>
+            </w:tcMar>
+          </w:tcPr>
+          <w:p>
+            <w:r>
+              <w:rPr>
+                <w:rFonts w:ascii="Arial" w:cs="Arial" w:eastAsia="Arial" w:hAnsi="Arial"/>
+                <w:b/>
+                <w:bCs/>
+                <w:color w:val="117A65"/>
+                <w:sz w:val="21"/>
+                <w:szCs w:val="21"/>
+              </w:rPr>
+              <w:t xml:space="preserve">Entregavel Sprint 7</w:t>
+            </w:r>
+          </w:p>
+          <w:p>
+            <w:pPr>
+              <w:spacing w:after="0" w:before="40"/>
+            </w:pPr>
+            <w:r>
+              <w:rPr>
+                <w:rFonts w:ascii="Arial" w:cs="Arial" w:eastAsia="Arial" w:hAnsi="Arial"/>
+                <w:sz w:val="20"/>
+                <w:szCs w:val="20"/>
+              </w:rPr>
+              <w:t xml:space="preserve">Vacinacao completa (individual e multipla) com baixa automatica de estoque e alertas de re-vacinacao configuraveis.</w:t>
+            </w:r>
+          </w:p>
+        </w:tc>
+      </w:tr>
+    </w:tbl>
+    <w:p>
+      <w:pPr>
+        <w:spacing w:after="0" w:before="80"/>
+      </w:pPr>
+    </w:p>
+    <w:p>
+      <w:pPr>
+        <w:pStyle w:val="Heading2"/>
+        <w:spacing w:after="100" w:before="260"/>
+      </w:pPr>
+      <w:r>
+        <w:rPr>
+          <w:rFonts w:ascii="Arial" w:cs="Arial" w:eastAsia="Arial" w:hAnsi="Arial"/>
+          <w:b/>
+          <w:bCs/>
+          <w:color w:val="1D9E75"/>
+          <w:sz w:val="26"/>
+          <w:szCs w:val="26"/>
+        </w:rPr>
+        <w:t xml:space="preserve">Sprint 8 -- Semanas 15 e 16: Homologacao M2</w:t>
+      </w:r>
+    </w:p>
+    <w:p>
+      <w:pPr>
+        <w:spacing w:after="80" w:before="80" w:line="340"/>
+        <w:jc w:val="both"/>
+      </w:pPr>
+      <w:r>
+        <w:rPr>
+          <w:rFonts w:ascii="Arial" w:cs="Arial" w:eastAsia="Arial" w:hAnsi="Arial"/>
+          <w:color w:val="666666"/>
+          <w:sz w:val="22"/>
+          <w:szCs w:val="22"/>
+        </w:rPr>
+        <w:t xml:space="preserve">Objetivo: deploy em staging, correcoes pos-testes, apresentacao formal e liberacao das parcelas 3 e 4.</w:t>
+      </w:r>
+    </w:p>
+    <w:p>
+      <w:pPr>
+        <w:spacing w:after="0" w:before="80"/>
+      </w:pPr>
+    </w:p>
+    <w:tbl>
+      <w:tblPr>
+        <w:tblW w:type="dxa" w:w="9360"/>
+        <w:tblBorders>
+          <w:top w:val="single" w:color="auto" w:sz="4"/>
+          <w:left w:val="single" w:color="auto" w:sz="4"/>
+          <w:bottom w:val="single" w:color="auto" w:sz="4"/>
+          <w:right w:val="single" w:color="auto" w:sz="4"/>
+          <w:insideH w:val="single" w:color="auto" w:sz="4"/>
+          <w:insideV w:val="single" w:color="auto" w:sz="4"/>
+        </w:tblBorders>
+      </w:tblPr>
+      <w:tblGrid>
+        <w:gridCol w:w="4680"/>
+        <w:gridCol w:w="4680"/>
+      </w:tblGrid>
+      <w:tr>
+        <w:trPr>
+          <w:tblHeader/>
+        </w:trPr>
+        <w:tc>
+          <w:tcPr>
+            <w:tcW w:type="dxa" w:w="4680"/>
+            <w:tcBorders>
+              <w:top w:val="single" w:color="CCCCCC" w:sz="1"/>
+              <w:left w:val="single" w:color="CCCCCC" w:sz="1"/>
+              <w:bottom w:val="single" w:color="CCCCCC" w:sz="1"/>
+              <w:right w:val="single" w:color="CCCCCC" w:sz="1"/>
+            </w:tcBorders>
+            <w:shd w:fill="185FA5" w:val="clear"/>
+            <w:tcMar>
+              <w:top w:type="dxa" w:w="80"/>
+              <w:left w:type="dxa" w:w="120"/>
+              <w:bottom w:type="dxa" w:w="80"/>
+              <w:right w:type="dxa" w:w="120"/>
+            </w:tcMar>
+          </w:tcPr>
+          <w:p>
+            <w:pPr>
+              <w:jc w:val="center"/>
+            </w:pPr>
+            <w:r>
+              <w:rPr>
+                <w:rFonts w:ascii="Arial" w:cs="Arial" w:eastAsia="Arial" w:hAnsi="Arial"/>
+                <w:b/>
+                <w:bCs/>
+                <w:color w:val="FFFFFF"/>
+                <w:sz w:val="20"/>
+                <w:szCs w:val="20"/>
+              </w:rPr>
+              <w:t xml:space="preserve">Dev 1 - Marco Tulio  (Back / DB)</w:t>
+            </w:r>
+          </w:p>
+        </w:tc>
+        <w:tc>
+          <w:tcPr>
+            <w:tcW w:type="dxa" w:w="4680"/>
+            <w:tcBorders>
+              <w:top w:val="single" w:color="CCCCCC" w:sz="1"/>
+              <w:left w:val="single" w:color="CCCCCC" w:sz="1"/>
+              <w:bottom w:val="single" w:color="CCCCCC" w:sz="1"/>
+              <w:right w:val="single" w:color="CCCCCC" w:sz="1"/>
+            </w:tcBorders>
+            <w:shd w:fill="117A65" w:val="clear"/>
+            <w:tcMar>
+              <w:top w:type="dxa" w:w="80"/>
+              <w:left w:type="dxa" w:w="120"/>
+              <w:bottom w:type="dxa" w:w="80"/>
+              <w:right w:type="dxa" w:w="120"/>
+            </w:tcMar>
+          </w:tcPr>
+          <w:p>
+            <w:pPr>
+              <w:jc w:val="center"/>
+            </w:pPr>
+            <w:r>
+              <w:rPr>
+                <w:rFonts w:ascii="Arial" w:cs="Arial" w:eastAsia="Arial" w:hAnsi="Arial"/>
+                <w:b/>
+                <w:bCs/>
+                <w:color w:val="FFFFFF"/>
+                <w:sz w:val="20"/>
+                <w:szCs w:val="20"/>
+              </w:rPr>
+              <w:t xml:space="preserve">Dev 2 - Joao Paiva  (UI / Back)</w:t>
+            </w:r>
+          </w:p>
+        </w:tc>
+      </w:tr>
+      <w:tr>
+        <w:tc>
+          <w:tcPr>
+            <w:tcW w:type="dxa" w:w="4680"/>
+            <w:tcBorders>
+              <w:top w:val="single" w:color="CCCCCC" w:sz="1"/>
+              <w:left w:val="single" w:color="CCCCCC" w:sz="1"/>
+              <w:bottom w:val="single" w:color="CCCCCC" w:sz="1"/>
+              <w:right w:val="single" w:color="CCCCCC" w:sz="1"/>
+            </w:tcBorders>
+            <w:shd w:fill="EBF5FB" w:val="clear"/>
+            <w:tcMar>
+              <w:top w:type="dxa" w:w="80"/>
+              <w:left w:type="dxa" w:w="120"/>
+              <w:bottom w:type="dxa" w:w="80"/>
+              <w:right w:type="dxa" w:w="80"/>
+            </w:tcMar>
+          </w:tcPr>
+          <w:p>
+            <w:r>
+              <w:rPr>
+                <w:rFonts w:ascii="Arial" w:cs="Arial" w:eastAsia="Arial" w:hAnsi="Arial"/>
+                <w:sz w:val="20"/>
+                <w:szCs w:val="20"/>
+              </w:rPr>
+              <w:t xml:space="preserve">-&gt; Correcoes de bugs criticos reportados nas Sprints 5-7</w:t>
+            </w:r>
+          </w:p>
+        </w:tc>
+        <w:tc>
+          <w:tcPr>
+            <w:tcW w:type="dxa" w:w="4680"/>
+            <w:tcBorders>
+              <w:top w:val="single" w:color="CCCCCC" w:sz="1"/>
+              <w:left w:val="single" w:color="CCCCCC" w:sz="1"/>
+              <w:bottom w:val="single" w:color="CCCCCC" w:sz="1"/>
+              <w:right w:val="single" w:color="CCCCCC" w:sz="1"/>
+            </w:tcBorders>
+            <w:shd w:fill="EAFAF1" w:val="clear"/>
+            <w:tcMar>
+              <w:top w:type="dxa" w:w="80"/>
+              <w:left w:type="dxa" w:w="120"/>
+              <w:bottom w:type="dxa" w:w="80"/>
+              <w:right w:type="dxa" w:w="80"/>
+            </w:tcMar>
+          </w:tcPr>
+          <w:p>
+            <w:r>
+              <w:rPr>
+                <w:rFonts w:ascii="Arial" w:cs="Arial" w:eastAsia="Arial" w:hAnsi="Arial"/>
+                <w:sz w:val="20"/>
+                <w:szCs w:val="20"/>
+              </w:rPr>
+              <w:t xml:space="preserve">-&gt; Ajustes de UX pos-feedback dos stakeholders das Sprints 5-7</w:t>
+            </w:r>
+          </w:p>
+        </w:tc>
+      </w:tr>
+      <w:tr>
+        <w:tc>
+          <w:tcPr>
+            <w:tcW w:type="dxa" w:w="4680"/>
+            <w:tcBorders>
+              <w:top w:val="single" w:color="CCCCCC" w:sz="1"/>
+              <w:left w:val="single" w:color="CCCCCC" w:sz="1"/>
+              <w:bottom w:val="single" w:color="CCCCCC" w:sz="1"/>
+              <w:right w:val="single" w:color="CCCCCC" w:sz="1"/>
+            </w:tcBorders>
+            <w:shd w:fill="EBF5FB" w:val="clear"/>
+            <w:tcMar>
+              <w:top w:type="dxa" w:w="80"/>
+              <w:left w:type="dxa" w:w="120"/>
+              <w:bottom w:type="dxa" w:w="80"/>
+              <w:right w:type="dxa" w:w="80"/>
+            </w:tcMar>
+          </w:tcPr>
+          <w:p>
+            <w:r>
+              <w:rPr>
+                <w:rFonts w:ascii="Arial" w:cs="Arial" w:eastAsia="Arial" w:hAnsi="Arial"/>
+                <w:sz w:val="20"/>
+                <w:szCs w:val="20"/>
+              </w:rPr>
+              <w:t xml:space="preserve">-&gt; Ajuste de performance: indices, queries N+1 pelo Prisma em MS3</w:t>
+            </w:r>
+          </w:p>
+        </w:tc>
+        <w:tc>
+          <w:tcPr>
+            <w:tcW w:type="dxa" w:w="4680"/>
+            <w:tcBorders>
+              <w:top w:val="single" w:color="CCCCCC" w:sz="1"/>
+              <w:left w:val="single" w:color="CCCCCC" w:sz="1"/>
+              <w:bottom w:val="single" w:color="CCCCCC" w:sz="1"/>
+              <w:right w:val="single" w:color="CCCCCC" w:sz="1"/>
+            </w:tcBorders>
+            <w:shd w:fill="EAFAF1" w:val="clear"/>
+            <w:tcMar>
+              <w:top w:type="dxa" w:w="80"/>
+              <w:left w:type="dxa" w:w="120"/>
+              <w:bottom w:type="dxa" w:w="80"/>
+              <w:right w:type="dxa" w:w="80"/>
+            </w:tcMar>
+          </w:tcPr>
+          <w:p>
+            <w:r>
+              <w:rPr>
+                <w:rFonts w:ascii="Arial" w:cs="Arial" w:eastAsia="Arial" w:hAnsi="Arial"/>
+                <w:sz w:val="20"/>
+                <w:szCs w:val="20"/>
+              </w:rPr>
+              <w:t xml:space="preserve">-&gt; Deploy PWA em staging com as telas de MS3 (mesmo ambiente do Marco M1)</w:t>
+            </w:r>
+          </w:p>
+        </w:tc>
+      </w:tr>
+      <w:tr>
+        <w:tc>
+          <w:tcPr>
+            <w:tcW w:type="dxa" w:w="4680"/>
+            <w:tcBorders>
+              <w:top w:val="single" w:color="CCCCCC" w:sz="1"/>
+              <w:left w:val="single" w:color="CCCCCC" w:sz="1"/>
+              <w:bottom w:val="single" w:color="CCCCCC" w:sz="1"/>
+              <w:right w:val="single" w:color="CCCCCC" w:sz="1"/>
+            </w:tcBorders>
+            <w:shd w:fill="EBF5FB" w:val="clear"/>
+            <w:tcMar>
+              <w:top w:type="dxa" w:w="80"/>
+              <w:left w:type="dxa" w:w="120"/>
+              <w:bottom w:type="dxa" w:w="80"/>
+              <w:right w:type="dxa" w:w="80"/>
+            </w:tcMar>
+          </w:tcPr>
+          <w:p>
+            <w:r>
+              <w:rPr>
+                <w:rFonts w:ascii="Arial" w:cs="Arial" w:eastAsia="Arial" w:hAnsi="Arial"/>
+                <w:sz w:val="20"/>
+                <w:szCs w:val="20"/>
+              </w:rPr>
+              <w:t xml:space="preserve">-&gt; Extensao do ambiente de staging existente para MS3 (mesma infra do Marco M1)</w:t>
+            </w:r>
+          </w:p>
+        </w:tc>
+        <w:tc>
+          <w:tcPr>
+            <w:tcW w:type="dxa" w:w="4680"/>
+            <w:tcBorders>
+              <w:top w:val="single" w:color="CCCCCC" w:sz="1"/>
+              <w:left w:val="single" w:color="CCCCCC" w:sz="1"/>
+              <w:bottom w:val="single" w:color="CCCCCC" w:sz="1"/>
+              <w:right w:val="single" w:color="CCCCCC" w:sz="1"/>
+            </w:tcBorders>
+            <w:shd w:fill="EAFAF1" w:val="clear"/>
+            <w:tcMar>
+              <w:top w:type="dxa" w:w="80"/>
+              <w:left w:type="dxa" w:w="120"/>
+              <w:bottom w:type="dxa" w:w="80"/>
+              <w:right w:type="dxa" w:w="80"/>
+            </w:tcMar>
+          </w:tcPr>
+          <w:p>
+            <w:r>
+              <w:rPr>
+                <w:rFonts w:ascii="Arial" w:cs="Arial" w:eastAsia="Arial" w:hAnsi="Arial"/>
+                <w:sz w:val="20"/>
+                <w:szCs w:val="20"/>
+              </w:rPr>
+              <w:t xml:space="preserve">-&gt; Smoke tests end-to-end em staging (atendimento, exame, vacinacao)</w:t>
+            </w:r>
+          </w:p>
+        </w:tc>
+      </w:tr>
+      <w:tr>
+        <w:tc>
+          <w:tcPr>
+            <w:tcW w:type="dxa" w:w="4680"/>
+            <w:tcBorders>
+              <w:top w:val="single" w:color="CCCCCC" w:sz="1"/>
+              <w:left w:val="single" w:color="CCCCCC" w:sz="1"/>
+              <w:bottom w:val="single" w:color="CCCCCC" w:sz="1"/>
+              <w:right w:val="single" w:color="CCCCCC" w:sz="1"/>
+            </w:tcBorders>
+            <w:shd w:fill="EBF5FB" w:val="clear"/>
+            <w:tcMar>
+              <w:top w:type="dxa" w:w="80"/>
+              <w:left w:type="dxa" w:w="120"/>
+              <w:bottom w:type="dxa" w:w="80"/>
+              <w:right w:type="dxa" w:w="80"/>
+            </w:tcMar>
+          </w:tcPr>
+          <w:p>
+            <w:r>
+              <w:rPr>
+                <w:rFonts w:ascii="Arial" w:cs="Arial" w:eastAsia="Arial" w:hAnsi="Arial"/>
+                <w:sz w:val="20"/>
+                <w:szCs w:val="20"/>
+              </w:rPr>
+              <w:t xml:space="preserve">-&gt; Seed de dados clinicos realistas (fichas, exames, vacinas) para sessao de homologacao</w:t>
+            </w:r>
+          </w:p>
+        </w:tc>
+        <w:tc>
+          <w:tcPr>
+            <w:tcW w:type="dxa" w:w="4680"/>
+            <w:tcBorders>
+              <w:top w:val="single" w:color="CCCCCC" w:sz="1"/>
+              <w:left w:val="single" w:color="CCCCCC" w:sz="1"/>
+              <w:bottom w:val="single" w:color="CCCCCC" w:sz="1"/>
+              <w:right w:val="single" w:color="CCCCCC" w:sz="1"/>
+            </w:tcBorders>
+            <w:shd w:fill="EAFAF1" w:val="clear"/>
+            <w:tcMar>
+              <w:top w:type="dxa" w:w="80"/>
+              <w:left w:type="dxa" w:w="120"/>
+              <w:bottom w:type="dxa" w:w="80"/>
+              <w:right w:type="dxa" w:w="80"/>
+            </w:tcMar>
+          </w:tcPr>
+          <w:p>
+            <w:r>
+              <w:rPr>
+                <w:rFonts w:ascii="Arial" w:cs="Arial" w:eastAsia="Arial" w:hAnsi="Arial"/>
+                <w:sz w:val="20"/>
+                <w:szCs w:val="20"/>
+              </w:rPr>
+              <w:t xml:space="preserve">-&gt; Guia de uso do modulo clinico para os stakeholders</w:t>
+            </w:r>
+          </w:p>
+        </w:tc>
+      </w:tr>
+      <w:tr>
+        <w:tc>
+          <w:tcPr>
+            <w:tcW w:type="dxa" w:w="4680"/>
+            <w:tcBorders>
+              <w:top w:val="single" w:color="CCCCCC" w:sz="1"/>
+              <w:left w:val="single" w:color="CCCCCC" w:sz="1"/>
+              <w:bottom w:val="single" w:color="CCCCCC" w:sz="1"/>
+              <w:right w:val="single" w:color="CCCCCC" w:sz="1"/>
+            </w:tcBorders>
+            <w:shd w:fill="EBF5FB" w:val="clear"/>
+            <w:tcMar>
+              <w:top w:type="dxa" w:w="80"/>
+              <w:left w:type="dxa" w:w="120"/>
+              <w:bottom w:type="dxa" w:w="80"/>
+              <w:right w:type="dxa" w:w="80"/>
+            </w:tcMar>
+          </w:tcPr>
+          <w:p>
+            <w:r>
+              <w:rPr>
+                <w:rFonts w:ascii="Arial" w:cs="Arial" w:eastAsia="Arial" w:hAnsi="Arial"/>
+                <w:sz w:val="20"/>
+                <w:szCs w:val="20"/>
+              </w:rPr>
+              <w:t xml:space="preserve">-&gt; Revisao de seguranca: RLS tests, secrets no CI, npm audit em MS3</w:t>
+            </w:r>
+          </w:p>
+        </w:tc>
+        <w:tc>
+          <w:tcPr>
+            <w:tcW w:type="dxa" w:w="4680"/>
+            <w:tcBorders>
+              <w:top w:val="single" w:color="CCCCCC" w:sz="1"/>
+              <w:left w:val="single" w:color="CCCCCC" w:sz="1"/>
+              <w:bottom w:val="single" w:color="CCCCCC" w:sz="1"/>
+              <w:right w:val="single" w:color="CCCCCC" w:sz="1"/>
+            </w:tcBorders>
+            <w:shd w:fill="EAFAF1" w:val="clear"/>
+            <w:tcMar>
+              <w:top w:type="dxa" w:w="80"/>
+              <w:left w:type="dxa" w:w="120"/>
+              <w:bottom w:type="dxa" w:w="80"/>
+              <w:right w:type="dxa" w:w="80"/>
+            </w:tcMar>
+          </w:tcPr>
+          <w:p>
+            <w:r>
+              <w:rPr>
+                <w:rFonts w:ascii="Arial" w:cs="Arial" w:eastAsia="Arial" w:hAnsi="Arial"/>
+                <w:sz w:val="20"/>
+                <w:szCs w:val="20"/>
+              </w:rPr>
+              <w:t xml:space="preserve">-&gt; Apresentacao formal M2: demo ao vivo para Rossano e Lais</w:t>
+            </w:r>
+          </w:p>
+        </w:tc>
+      </w:tr>
+      <w:tr>
+        <w:tc>
+          <w:tcPr>
+            <w:tcW w:type="dxa" w:w="4680"/>
+            <w:tcBorders>
+              <w:top w:val="single" w:color="CCCCCC" w:sz="1"/>
+              <w:left w:val="single" w:color="CCCCCC" w:sz="1"/>
+              <w:bottom w:val="single" w:color="CCCCCC" w:sz="1"/>
+              <w:right w:val="single" w:color="CCCCCC" w:sz="1"/>
+            </w:tcBorders>
+            <w:shd w:fill="EBF5FB" w:val="clear"/>
+            <w:tcMar>
+              <w:top w:type="dxa" w:w="80"/>
+              <w:left w:type="dxa" w:w="120"/>
+              <w:bottom w:type="dxa" w:w="80"/>
+              <w:right w:type="dxa" w:w="80"/>
+            </w:tcMar>
+          </w:tcPr>
+          <w:p>
+            <w:r>
+              <w:rPr>
+                <w:rFonts w:ascii="Arial" w:cs="Arial" w:eastAsia="Arial" w:hAnsi="Arial"/>
+                <w:sz w:val="20"/>
+                <w:szCs w:val="20"/>
+              </w:rPr>
+              <w:t xml:space="preserve">-&gt; Documentacao: manual de implantacao MS3</w:t>
+            </w:r>
+          </w:p>
+        </w:tc>
+        <w:tc>
+          <w:tcPr>
+            <w:tcW w:type="dxa" w:w="4680"/>
+            <w:tcBorders>
+              <w:top w:val="single" w:color="CCCCCC" w:sz="1"/>
+              <w:left w:val="single" w:color="CCCCCC" w:sz="1"/>
+              <w:bottom w:val="single" w:color="CCCCCC" w:sz="1"/>
+              <w:right w:val="single" w:color="CCCCCC" w:sz="1"/>
+            </w:tcBorders>
+            <w:shd w:fill="EAFAF1" w:val="clear"/>
+            <w:tcMar>
+              <w:top w:type="dxa" w:w="80"/>
+              <w:left w:type="dxa" w:w="120"/>
+              <w:bottom w:type="dxa" w:w="80"/>
+              <w:right w:type="dxa" w:w="80"/>
+            </w:tcMar>
+          </w:tcPr>
+          <w:p>
+            <w:r>
+              <w:rPr>
+                <w:rFonts w:ascii="Arial" w:cs="Arial" w:eastAsia="Arial" w:hAnsi="Arial"/>
+                <w:sz w:val="20"/>
+                <w:szCs w:val="20"/>
+              </w:rPr>
+              <w:t xml:space="preserve">-&gt; Coleta de feedback e abertura de issues para M3</w:t>
+            </w:r>
+          </w:p>
+        </w:tc>
+      </w:tr>
+      <w:tr>
+        <w:tc>
+          <w:tcPr>
+            <w:tcW w:type="dxa" w:w="4680"/>
+            <w:tcBorders>
+              <w:top w:val="single" w:color="CCCCCC" w:sz="1"/>
+              <w:left w:val="single" w:color="CCCCCC" w:sz="1"/>
+              <w:bottom w:val="single" w:color="CCCCCC" w:sz="1"/>
+              <w:right w:val="single" w:color="CCCCCC" w:sz="1"/>
+            </w:tcBorders>
+            <w:shd w:fill="EBF5FB" w:val="clear"/>
+            <w:tcMar>
+              <w:top w:type="dxa" w:w="80"/>
+              <w:left w:type="dxa" w:w="120"/>
+              <w:bottom w:type="dxa" w:w="80"/>
+              <w:right w:type="dxa" w:w="80"/>
+            </w:tcMar>
+          </w:tcPr>
+          <w:p>
+            <w:r>
+              <w:rPr>
+                <w:rFonts w:ascii="Arial" w:cs="Arial" w:eastAsia="Arial" w:hAnsi="Arial"/>
+                <w:sz w:val="20"/>
+                <w:szCs w:val="20"/>
+              </w:rPr>
+              <w:t xml:space="preserve">-&gt; Preparacao e conducao do demo para stakeholders</w:t>
+            </w:r>
+          </w:p>
+        </w:tc>
+        <w:tc>
+          <w:tcPr>
+            <w:tcW w:type="dxa" w:w="4680"/>
+            <w:tcBorders>
+              <w:top w:val="single" w:color="CCCCCC" w:sz="1"/>
+              <w:left w:val="single" w:color="CCCCCC" w:sz="1"/>
+              <w:bottom w:val="single" w:color="CCCCCC" w:sz="1"/>
+              <w:right w:val="single" w:color="CCCCCC" w:sz="1"/>
+            </w:tcBorders>
+            <w:shd w:fill="EAFAF1" w:val="clear"/>
+            <w:tcMar>
+              <w:top w:type="dxa" w:w="80"/>
+              <w:left w:type="dxa" w:w="120"/>
+              <w:bottom w:type="dxa" w:w="80"/>
+              <w:right w:type="dxa" w:w="80"/>
+            </w:tcMar>
+          </w:tcPr>
+          <w:p>
+            <w:r>
+              <w:rPr>
+                <w:rFonts w:ascii="Arial" w:cs="Arial" w:eastAsia="Arial" w:hAnsi="Arial"/>
+                <w:sz w:val="20"/>
+                <w:szCs w:val="20"/>
+              </w:rPr>
+              <w:t xml:space="preserve">-&gt; Atualizacao do board GitHub Projects para M3</w:t>
+            </w:r>
+          </w:p>
+        </w:tc>
+      </w:tr>
+    </w:tbl>
+    <w:p>
+      <w:pPr>
+        <w:spacing w:after="0" w:before="80"/>
+      </w:pPr>
+    </w:p>
+    <w:tbl>
+      <w:tblPr>
+        <w:tblW w:type="dxa" w:w="9360"/>
+        <w:tblBorders>
+          <w:top w:val="single" w:color="auto" w:sz="4"/>
+          <w:left w:val="single" w:color="auto" w:sz="4"/>
+          <w:bottom w:val="single" w:color="auto" w:sz="4"/>
+          <w:right w:val="single" w:color="auto" w:sz="4"/>
+          <w:insideH w:val="single" w:color="auto" w:sz="4"/>
+          <w:insideV w:val="single" w:color="auto" w:sz="4"/>
+        </w:tblBorders>
+      </w:tblPr>
+      <w:tblGrid>
+        <w:gridCol w:w="9360"/>
+      </w:tblGrid>
+      <w:tr>
+        <w:tc>
+          <w:tcPr>
+            <w:tcBorders>
+              <w:top w:val="single" w:color="C0392B" w:sz="8"/>
+              <w:left w:val="single" w:color="C0392B" w:sz="8"/>
+              <w:bottom w:val="single" w:color="CCCCCC" w:sz="1"/>
+              <w:right w:val="single" w:color="CCCCCC" w:sz="1"/>
+            </w:tcBorders>
+            <w:shd w:fill="FEF5F5" w:val="clear"/>
+            <w:tcMar>
+              <w:top w:type="dxa" w:w="120"/>
+              <w:left w:type="dxa" w:w="220"/>
+              <w:bottom w:type="dxa" w:w="120"/>
+              <w:right w:type="dxa" w:w="220"/>
+            </w:tcMar>
+          </w:tcPr>
+          <w:p>
+            <w:r>
+              <w:rPr>
+                <w:rFonts w:ascii="Arial" w:cs="Arial" w:eastAsia="Arial" w:hAnsi="Arial"/>
+                <w:b/>
+                <w:bCs/>
+                <w:color w:val="C0392B"/>
+                <w:sz w:val="21"/>
+                <w:szCs w:val="21"/>
+              </w:rPr>
+              <w:t xml:space="preserve">Marco M2 -- Criterios de Aceite (Clausula 7a)</w:t>
+            </w:r>
+          </w:p>
+          <w:p>
+            <w:pPr>
+              <w:spacing w:after="0" w:before="40"/>
+            </w:pPr>
+            <w:r>
+              <w:rPr>
+                <w:rFonts w:ascii="Arial" w:cs="Arial" w:eastAsia="Arial" w:hAnsi="Arial"/>
+                <w:sz w:val="20"/>
+                <w:szCs w:val="20"/>
+              </w:rPr>
+              <w:t xml:space="preserve">1. Modulos de Atendimento Clinico, Exames e Vacinacao funcionais em staging.</w:t>
+            </w:r>
+          </w:p>
+          <w:p>
+            <w:pPr>
+              <w:spacing w:after="0" w:before="40"/>
+            </w:pPr>
+            <w:r>
+              <w:rPr>
+                <w:rFonts w:ascii="Arial" w:cs="Arial" w:eastAsia="Arial" w:hAnsi="Arial"/>
+                <w:sz w:val="20"/>
+                <w:szCs w:val="20"/>
+              </w:rPr>
+              <w:t xml:space="preserve">2. CI/CD verde em MS3 (lint, testes, build, npm audit).</w:t>
+            </w:r>
+          </w:p>
+          <w:p>
+            <w:pPr>
+              <w:spacing w:after="0" w:before="40"/>
+            </w:pPr>
+            <w:r>
+              <w:rPr>
+                <w:rFonts w:ascii="Arial" w:cs="Arial" w:eastAsia="Arial" w:hAnsi="Arial"/>
+                <w:sz w:val="20"/>
+                <w:szCs w:val="20"/>
+              </w:rPr>
+              <w:t xml:space="preserve">3. Cobertura de testes &gt;= 70% nos servicos criticos (RNF-MAN-003).</w:t>
+            </w:r>
+          </w:p>
+          <w:p>
+            <w:pPr>
+              <w:spacing w:after="0" w:before="40"/>
+            </w:pPr>
+            <w:r>
+              <w:rPr>
+                <w:rFonts w:ascii="Arial" w:cs="Arial" w:eastAsia="Arial" w:hAnsi="Arial"/>
+                <w:sz w:val="20"/>
+                <w:szCs w:val="20"/>
+              </w:rPr>
+              <w:t xml:space="preserve">4. Stakeholders aprovam em ate 5 dias uteis apos apresentacao (Clausula 7a SS1).</w:t>
+            </w:r>
+          </w:p>
+          <w:p>
+            <w:pPr>
+              <w:spacing w:after="0" w:before="40"/>
+            </w:pPr>
+            <w:r>
+              <w:rPr>
+                <w:rFonts w:ascii="Arial" w:cs="Arial" w:eastAsia="Arial" w:hAnsi="Arial"/>
+                <w:sz w:val="20"/>
+                <w:szCs w:val="20"/>
+              </w:rPr>
+              <w:t xml:space="preserve">5. Apos aceite: parcelas 3 e 4/10 (R$ 2.000,00) liberadas (Clausula 4a).</w:t>
+            </w:r>
+          </w:p>
+        </w:tc>
+      </w:tr>
+    </w:tbl>
+    <w:p>
+      <w:pPr>
+        <w:spacing w:after="0" w:before="80"/>
+      </w:pPr>
+    </w:p>
+    <w:p>
+      <w:pPr>
+        <w:pStyle w:val="Heading1"/>
+        <w:pBdr>
+          <w:bottom w:val="single" w:color="1A3A5C" w:sz="8" w:space="6"/>
+        </w:pBdr>
+        <w:spacing w:after="120" w:before="380"/>
+      </w:pPr>
+      <w:r>
+        <w:rPr>
+          <w:rFonts w:ascii="Arial" w:cs="Arial" w:eastAsia="Arial" w:hAnsi="Arial"/>
+          <w:b/>
+          <w:bCs/>
+          <w:color w:val="1A3A5C"/>
+          <w:sz w:val="30"/>
+          <w:szCs w:val="30"/>
+        </w:rPr>
+        <w:t xml:space="preserve">6. Fluxo de Orquestracao Semanal</w:t>
       </w:r>
     </w:p>
     <w:p>
@@ -7765,7 +10272,7 @@
           <w:sz w:val="26"/>
           <w:szCs w:val="26"/>
         </w:rPr>
-        <w:t xml:space="preserve">5.1 Regra de Desbloqueio -- Padrao MockService</w:t>
+        <w:t xml:space="preserve">6.1 Regra de Desbloqueio -- Padrao MockService</w:t>
       </w:r>
     </w:p>
     <w:tbl>
@@ -7900,7 +10407,7 @@
           <w:sz w:val="26"/>
           <w:szCs w:val="26"/>
         </w:rPr>
-        <w:t xml:space="preserve">5.2 Canais de Comunicacao</w:t>
+        <w:t xml:space="preserve">6.2 Canais de Comunicacao</w:t>
       </w:r>
     </w:p>
     <w:p>
@@ -8661,7 +11168,7 @@
           <w:sz w:val="30"/>
           <w:szCs w:val="30"/>
         </w:rPr>
-        <w:t xml:space="preserve">6. Convencoes de Codigo e Git</w:t>
+        <w:t xml:space="preserve">7. Convencoes de Codigo e Git</w:t>
       </w:r>
     </w:p>
     <w:p>
@@ -8683,7 +11190,7 @@
           <w:sz w:val="26"/>
           <w:szCs w:val="26"/>
         </w:rPr>
-        <w:t xml:space="preserve">6.1 Estrutura de Branches</w:t>
+        <w:t xml:space="preserve">7.1 Estrutura de Branches</w:t>
       </w:r>
     </w:p>
     <w:tbl>
@@ -8838,7 +11345,7 @@
           <w:sz w:val="26"/>
           <w:szCs w:val="26"/>
         </w:rPr>
-        <w:t xml:space="preserve">6.2 Conventional Commits</w:t>
+        <w:t xml:space="preserve">7.2 Conventional Commits</w:t>
       </w:r>
     </w:p>
     <w:p>
@@ -9599,7 +12106,7 @@
           <w:sz w:val="30"/>
           <w:szCs w:val="30"/>
         </w:rPr>
-        <w:t xml:space="preserve">7. Definicao de Pronto (Definition of Done)</w:t>
+        <w:t xml:space="preserve">8. Definicao de Pronto (Definition of Done)</w:t>
       </w:r>
     </w:p>
     <w:p>
@@ -10875,7 +13382,7 @@
           <w:sz w:val="30"/>
           <w:szCs w:val="30"/>
         </w:rPr>
-        <w:t xml:space="preserve">8. Regras Inegociaveis</w:t>
+        <w:t xml:space="preserve">9. Regras Inegociaveis</w:t>
       </w:r>
     </w:p>
     <w:p>
@@ -11162,7 +13669,7 @@
           <w:sz w:val="30"/>
           <w:szCs w:val="30"/>
         </w:rPr>
-        <w:t xml:space="preserve">9. Ciencia e Acordo da Equipe</w:t>
+        <w:t xml:space="preserve">10. Ciencia e Acordo da Equipe</w:t>
       </w:r>
     </w:p>
     <w:p>
@@ -11684,6 +14191,48 @@
                 <w:szCs w:val="20"/>
               </w:rPr>
               <w:t xml:space="preserve">Equipe de Desenvolvimento</w:t>
+            </w:r>
+          </w:p>
+        </w:tc>
+      </w:tr>
+      <w:tr>
+        <w:tc>
+          <w:tcPr>
+            <w:tcW w:type="dxa" w:w="1100"/>
+          </w:tcPr>
+          <w:p>
+            <w:r>
+              <w:t>1.1</w:t>
+            </w:r>
+          </w:p>
+        </w:tc>
+        <w:tc>
+          <w:tcPr>
+            <w:tcW w:type="dxa" w:w="1500"/>
+          </w:tcPr>
+          <w:p>
+            <w:r>
+              <w:t>Set/2026</w:t>
+            </w:r>
+          </w:p>
+        </w:tc>
+        <w:tc>
+          <w:tcPr>
+            <w:tcW w:type="dxa" w:w="4660"/>
+          </w:tcPr>
+          <w:p>
+            <w:r>
+              <w:t>Adiciona detalhamento de sprints do Marco M2 (MS3 -- Atendimento Clinico, Exames, Vacinacao). Renumera secoes 5-9 para 6-10.</w:t>
+            </w:r>
+          </w:p>
+        </w:tc>
+        <w:tc>
+          <w:tcPr>
+            <w:tcW w:type="dxa" w:w="2100"/>
+          </w:tcPr>
+          <w:p>
+            <w:r>
+              <w:t>Equipe de Desenvolvimento</w:t>
             </w:r>
           </w:p>
         </w:tc>

</xml_diff>

<commit_message>
chore(rebrand): renomeia VetEquine para Quiron Equine
Nome definido pelos stakeholders. Aplicado em duas regras: identificadores
tecnicos (escopo npm @vetequine/* -> @quironequine/*, role do Postgres
vetequine_app -> quironequine_app, usuario/rede do docker-compose, prefixo
do Redis, User-Agent do adapter do Nominatim) usam "quironequine"/
"QuironEquine" sem acento; prosa/UI/documentacao usa a grafia correta
"Quiron Equine".

Inclui um fix de lint pre-existente e nao relacionado: apps/pwa/public/sw.js
so caia no eslint.configs.recommended (o bloco de globals do projeto e
escopado a **/*.ts/**/*.tsx), entao no-undef falhava em toda API padrao de
Service Worker (self, caches, fetch...). Adicionado um bloco de globals
dedicado no eslint.config.mjs.

Nao inclui os PDFs ja assinados/executados (Contrato, ERS v1.0) -- mudar
isso e questao contratual, nao edicao de arquivo.

Co-Authored-By: Claude Sonnet 5 <noreply@anthropic.com>
</commit_message>
<xml_diff>
--- a/Documentação/PlanoTrabalho_KA_Construcao_VetEquine.docx
+++ b/Documentação/PlanoTrabalho_KA_Construcao_VetEquine.docx
@@ -65,7 +65,7 @@
           <w:sz w:val="20"/>
           <w:szCs w:val="20"/>
         </w:rPr>
-        <w:t xml:space="preserve">VetEquine SaaS -- Marcos M1-&gt;M5 -- Jun/2026 a Fev/2027</w:t>
+        <w:t>Quíron Equine SaaS -- Marcos M1-&gt;M5 -- Jun/2026 a Fev/2027</w:t>
       </w:r>
     </w:p>
     <w:tbl>
@@ -148,7 +148,7 @@
                 <w:sz w:val="20"/>
                 <w:szCs w:val="20"/>
               </w:rPr>
-              <w:t xml:space="preserve">VetEquine -- Sistema de Gestao Veterinaria Equina (SaaS)</w:t>
+              <w:t>Quíron Equine -- Sistema de Gestao Veterinaria Equina (SaaS)</w:t>
             </w:r>
           </w:p>
         </w:tc>
@@ -666,7 +666,7 @@
           <w:sz w:val="22"/>
           <w:szCs w:val="22"/>
         </w:rPr>
-        <w:t xml:space="preserve">Este documento formaliza a divisao de responsabilidades, o plano de sprints e o fluxo de orquestracao entre os dois desenvolvedores do projeto VetEquine durante a fase de KA Construcao, em conformidade com o SWEBOK v4.0 e com o Contrato assinado em 15 de junho de 2026.</w:t>
+        <w:t>Este documento formaliza a divisao de responsabilidades, o plano de sprints e o fluxo de orquestracao entre os dois desenvolvedores do projeto Quíron Equine durante a fase de KA Construcao, em conformidade com o SWEBOK v4.0 e com o Contrato assinado em 15 de junho de 2026.</w:t>
       </w:r>
     </w:p>
     <w:p>
@@ -14223,6 +14223,48 @@
           <w:p>
             <w:r>
               <w:t>Adiciona detalhamento de sprints do Marco M2 (MS3 -- Atendimento Clinico, Exames, Vacinacao). Renumera secoes 5-9 para 6-10.</w:t>
+            </w:r>
+          </w:p>
+        </w:tc>
+        <w:tc>
+          <w:tcPr>
+            <w:tcW w:type="dxa" w:w="2100"/>
+          </w:tcPr>
+          <w:p>
+            <w:r>
+              <w:t>Equipe de Desenvolvimento</w:t>
+            </w:r>
+          </w:p>
+        </w:tc>
+      </w:tr>
+      <w:tr>
+        <w:tc>
+          <w:tcPr>
+            <w:tcW w:type="dxa" w:w="1100"/>
+          </w:tcPr>
+          <w:p>
+            <w:r>
+              <w:t>1.2</w:t>
+            </w:r>
+          </w:p>
+        </w:tc>
+        <w:tc>
+          <w:tcPr>
+            <w:tcW w:type="dxa" w:w="1500"/>
+          </w:tcPr>
+          <w:p>
+            <w:r>
+              <w:t>Set/2026</w:t>
+            </w:r>
+          </w:p>
+        </w:tc>
+        <w:tc>
+          <w:tcPr>
+            <w:tcW w:type="dxa" w:w="4660"/>
+          </w:tcPr>
+          <w:p>
+            <w:r>
+              <w:t>Rebranding: VetEquine -&gt; Quiron Equine (nome definido pelos stakeholders).</w:t>
             </w:r>
           </w:p>
         </w:tc>

</xml_diff>